<commit_message>
Updated user manual. Added converter to go from docx to help_window.py
</commit_message>
<xml_diff>
--- a/SAR K9 Training Record User Manual.docx
+++ b/SAR K9 Training Record User Manual.docx
@@ -13,21 +13,30 @@
     </w:p>
     <w:p>
       <w:pPr>
-        <w:rPr>
-          <w:sz w:val="28"/>
-          <w:szCs w:val="28"/>
-        </w:rPr>
-      </w:pPr>
-      <w:r>
-        <w:rPr>
-          <w:sz w:val="28"/>
-          <w:szCs w:val="28"/>
-        </w:rPr>
-        <w:t>Preface:  This is a preliminary help file to get the user started.  This window can always be viewed by pushing F1 on your keyboard.</w:t>
-      </w:r>
-    </w:p>
-    <w:p>
-      <w:pPr>
+        <w:jc w:val="both"/>
+        <w:rPr>
+          <w:sz w:val="28"/>
+          <w:szCs w:val="28"/>
+        </w:rPr>
+      </w:pPr>
+      <w:r>
+        <w:rPr>
+          <w:sz w:val="28"/>
+          <w:szCs w:val="28"/>
+        </w:rPr>
+        <w:t>Preface: This is a preliminary help file to get the user started.  This window can always be viewed by pushing F1 on your keyboard.</w:t>
+      </w:r>
+      <w:r>
+        <w:rPr>
+          <w:sz w:val="28"/>
+          <w:szCs w:val="28"/>
+        </w:rPr>
+        <w:t xml:space="preserve">  It is advised that the user read this entire document one time to get an idea of how to use the program.  However, it is not necessary to memorize it since tooltips pop up when hovering the mouse over most of the more complicated entries.</w:t>
+      </w:r>
+    </w:p>
+    <w:p>
+      <w:pPr>
+        <w:jc w:val="both"/>
         <w:rPr>
           <w:sz w:val="28"/>
           <w:szCs w:val="28"/>
@@ -48,6 +57,7 @@
           <w:ilvl w:val="0"/>
           <w:numId w:val="1"/>
         </w:numPr>
+        <w:jc w:val="both"/>
         <w:rPr>
           <w:sz w:val="28"/>
           <w:szCs w:val="28"/>
@@ -82,6 +92,7 @@
           <w:ilvl w:val="0"/>
           <w:numId w:val="1"/>
         </w:numPr>
+        <w:jc w:val="both"/>
         <w:rPr>
           <w:sz w:val="28"/>
           <w:szCs w:val="28"/>
@@ -102,17 +113,32 @@
           <w:ilvl w:val="0"/>
           <w:numId w:val="1"/>
         </w:numPr>
-        <w:rPr>
-          <w:sz w:val="28"/>
-          <w:szCs w:val="28"/>
-        </w:rPr>
-      </w:pPr>
-      <w:r>
-        <w:rPr>
-          <w:sz w:val="28"/>
-          <w:szCs w:val="28"/>
-        </w:rPr>
-        <w:t>Select a backup folder.  While optional, it is STRONGLY recommended to configure this.  Ideally, this folder should reside on an external hard drive or another service such as Google Drive.  This additional redundancy helps ensure that data is never lost.</w:t>
+        <w:jc w:val="both"/>
+        <w:rPr>
+          <w:sz w:val="28"/>
+          <w:szCs w:val="28"/>
+        </w:rPr>
+      </w:pPr>
+      <w:r>
+        <w:rPr>
+          <w:sz w:val="28"/>
+          <w:szCs w:val="28"/>
+        </w:rPr>
+        <w:t>Select a backup folder.  While optional, it is STRONGLY recommended to configure this.  Ideally, this folder should reside on an external hard drive or another service such as Google Drive</w:t>
+      </w:r>
+      <w:r>
+        <w:rPr>
+          <w:sz w:val="28"/>
+          <w:szCs w:val="28"/>
+        </w:rPr>
+        <w:t xml:space="preserve"> or Dropbox</w:t>
+      </w:r>
+      <w:r>
+        <w:rPr>
+          <w:sz w:val="28"/>
+          <w:szCs w:val="28"/>
+        </w:rPr>
+        <w:t>.  This additional redundancy helps ensure that data is never lost.</w:t>
       </w:r>
     </w:p>
     <w:p>
@@ -122,6 +148,7 @@
           <w:ilvl w:val="0"/>
           <w:numId w:val="1"/>
         </w:numPr>
+        <w:jc w:val="both"/>
         <w:rPr>
           <w:sz w:val="28"/>
           <w:szCs w:val="28"/>
@@ -149,31 +176,18 @@
           <w:ilvl w:val="0"/>
           <w:numId w:val="1"/>
         </w:numPr>
-        <w:rPr>
-          <w:sz w:val="28"/>
-          <w:szCs w:val="28"/>
-        </w:rPr>
-      </w:pPr>
-      <w:r>
-        <w:rPr>
-          <w:sz w:val="28"/>
-          <w:szCs w:val="28"/>
-        </w:rPr>
-        <w:t xml:space="preserve">Now enter training locations that will be used repeatedly. While not required, this shortcut will simplify data entry later.  To enter a </w:t>
-      </w:r>
-      <w:r>
-        <w:rPr>
-          <w:sz w:val="28"/>
-          <w:szCs w:val="28"/>
-        </w:rPr>
-        <w:t>location,</w:t>
-      </w:r>
-      <w:r>
-        <w:rPr>
-          <w:sz w:val="28"/>
-          <w:szCs w:val="28"/>
-        </w:rPr>
-        <w:t xml:space="preserve"> either type in the name followed by ‘Enter’ or click the ‘Add Location’ button.</w:t>
+        <w:jc w:val="both"/>
+        <w:rPr>
+          <w:sz w:val="28"/>
+          <w:szCs w:val="28"/>
+        </w:rPr>
+      </w:pPr>
+      <w:r>
+        <w:rPr>
+          <w:sz w:val="28"/>
+          <w:szCs w:val="28"/>
+        </w:rPr>
+        <w:t>Configure a folder for Excel compatible data files.</w:t>
       </w:r>
     </w:p>
     <w:p>
@@ -183,17 +197,32 @@
           <w:ilvl w:val="0"/>
           <w:numId w:val="1"/>
         </w:numPr>
-        <w:rPr>
-          <w:sz w:val="28"/>
-          <w:szCs w:val="28"/>
-        </w:rPr>
-      </w:pPr>
-      <w:r>
-        <w:rPr>
-          <w:sz w:val="28"/>
-          <w:szCs w:val="28"/>
-        </w:rPr>
-        <w:t>Dog names are entered in an identical manner.  Unlike location names, however, all dogs that are to be recorded must be entered here.</w:t>
+        <w:jc w:val="both"/>
+        <w:rPr>
+          <w:sz w:val="28"/>
+          <w:szCs w:val="28"/>
+        </w:rPr>
+      </w:pPr>
+      <w:r>
+        <w:rPr>
+          <w:sz w:val="28"/>
+          <w:szCs w:val="28"/>
+        </w:rPr>
+        <w:t xml:space="preserve">Now enter training locations that will be used repeatedly. While not required, this shortcut will simplify data entry later.  To enter a </w:t>
+      </w:r>
+      <w:r>
+        <w:rPr>
+          <w:sz w:val="28"/>
+          <w:szCs w:val="28"/>
+        </w:rPr>
+        <w:t>location,</w:t>
+      </w:r>
+      <w:r>
+        <w:rPr>
+          <w:sz w:val="28"/>
+          <w:szCs w:val="28"/>
+        </w:rPr>
+        <w:t xml:space="preserve"> either type in the name followed by ‘Enter’ or click the ‘Add Location’ button.</w:t>
       </w:r>
     </w:p>
     <w:p>
@@ -203,31 +232,18 @@
           <w:ilvl w:val="0"/>
           <w:numId w:val="1"/>
         </w:numPr>
-        <w:rPr>
-          <w:sz w:val="28"/>
-          <w:szCs w:val="28"/>
-        </w:rPr>
-      </w:pPr>
-      <w:r>
-        <w:rPr>
-          <w:sz w:val="28"/>
-          <w:szCs w:val="28"/>
-        </w:rPr>
-        <w:t xml:space="preserve">Terrain Types and Distraction types are entered in a similar manner.  The user can adjust the order they appear in the table as desired. </w:t>
-      </w:r>
-      <w:r>
-        <w:rPr>
-          <w:sz w:val="28"/>
-          <w:szCs w:val="28"/>
-        </w:rPr>
-        <w:t>The m</w:t>
-      </w:r>
-      <w:r>
-        <w:rPr>
-          <w:sz w:val="28"/>
-          <w:szCs w:val="28"/>
-        </w:rPr>
-        <w:t>ost commonly used entries should usually appear at the top of each list.</w:t>
+        <w:jc w:val="both"/>
+        <w:rPr>
+          <w:sz w:val="28"/>
+          <w:szCs w:val="28"/>
+        </w:rPr>
+      </w:pPr>
+      <w:r>
+        <w:rPr>
+          <w:sz w:val="28"/>
+          <w:szCs w:val="28"/>
+        </w:rPr>
+        <w:t>Dog names are entered in an identical manner.  Unlike location names, however, all dogs that are to be recorded must be entered here.</w:t>
       </w:r>
     </w:p>
     <w:p>
@@ -237,16 +253,53 @@
           <w:ilvl w:val="0"/>
           <w:numId w:val="1"/>
         </w:numPr>
-        <w:rPr>
-          <w:sz w:val="28"/>
-          <w:szCs w:val="28"/>
-        </w:rPr>
-      </w:pPr>
-      <w:r>
-        <w:rPr>
-          <w:sz w:val="28"/>
-          <w:szCs w:val="28"/>
-        </w:rPr>
+        <w:jc w:val="both"/>
+        <w:rPr>
+          <w:sz w:val="28"/>
+          <w:szCs w:val="28"/>
+        </w:rPr>
+      </w:pPr>
+      <w:r>
+        <w:rPr>
+          <w:sz w:val="28"/>
+          <w:szCs w:val="28"/>
+        </w:rPr>
+        <w:t xml:space="preserve">Terrain Types and Distraction types are entered in a similar manner.  The user can adjust the order they appear in the table as desired. </w:t>
+      </w:r>
+      <w:r>
+        <w:rPr>
+          <w:sz w:val="28"/>
+          <w:szCs w:val="28"/>
+        </w:rPr>
+        <w:t>The m</w:t>
+      </w:r>
+      <w:r>
+        <w:rPr>
+          <w:sz w:val="28"/>
+          <w:szCs w:val="28"/>
+        </w:rPr>
+        <w:t>ost commonly used entries should usually appear at the top of each list.</w:t>
+      </w:r>
+    </w:p>
+    <w:p>
+      <w:pPr>
+        <w:pStyle w:val="ListParagraph"/>
+        <w:numPr>
+          <w:ilvl w:val="0"/>
+          <w:numId w:val="1"/>
+        </w:numPr>
+        <w:jc w:val="both"/>
+        <w:rPr>
+          <w:sz w:val="28"/>
+          <w:szCs w:val="28"/>
+        </w:rPr>
+      </w:pPr>
+      <w:r>
+        <w:rPr>
+          <w:sz w:val="28"/>
+          <w:szCs w:val="28"/>
+        </w:rPr>
+        <w:lastRenderedPageBreak/>
         <w:t>Now click ‘Save Configuration’ then exit the program (using the</w:t>
       </w:r>
       <w:r>
@@ -268,11 +321,26 @@
           <w:sz w:val="28"/>
           <w:szCs w:val="28"/>
         </w:rPr>
-        <w:t>} at the upper right corner of the window.</w:t>
-      </w:r>
-    </w:p>
-    <w:p>
-      <w:pPr>
+        <w:t>} at the upper right corner of the window</w:t>
+      </w:r>
+      <w:r>
+        <w:rPr>
+          <w:sz w:val="28"/>
+          <w:szCs w:val="28"/>
+        </w:rPr>
+        <w:t xml:space="preserve"> or by clicking the ‘Quit’ button</w:t>
+      </w:r>
+      <w:r>
+        <w:rPr>
+          <w:sz w:val="28"/>
+          <w:szCs w:val="28"/>
+        </w:rPr>
+        <w:t>.</w:t>
+      </w:r>
+    </w:p>
+    <w:p>
+      <w:pPr>
+        <w:jc w:val="both"/>
         <w:rPr>
           <w:sz w:val="28"/>
           <w:szCs w:val="28"/>
@@ -293,18 +361,158 @@
           <w:ilvl w:val="0"/>
           <w:numId w:val="2"/>
         </w:numPr>
-        <w:rPr>
-          <w:sz w:val="28"/>
-          <w:szCs w:val="28"/>
-        </w:rPr>
-      </w:pPr>
-      <w:r>
-        <w:rPr>
-          <w:sz w:val="28"/>
-          <w:szCs w:val="28"/>
-        </w:rPr>
-        <w:lastRenderedPageBreak/>
-        <w:t>Restart the application and select either the ‘Area Search Session Tab’ or ‘Trailing Session Tab’ as needed.</w:t>
+        <w:jc w:val="both"/>
+        <w:rPr>
+          <w:sz w:val="28"/>
+          <w:szCs w:val="28"/>
+        </w:rPr>
+      </w:pPr>
+      <w:r>
+        <w:rPr>
+          <w:sz w:val="28"/>
+          <w:szCs w:val="28"/>
+        </w:rPr>
+        <w:t>General</w:t>
+      </w:r>
+    </w:p>
+    <w:p>
+      <w:pPr>
+        <w:pStyle w:val="ListParagraph"/>
+        <w:numPr>
+          <w:ilvl w:val="1"/>
+          <w:numId w:val="2"/>
+        </w:numPr>
+        <w:jc w:val="both"/>
+        <w:rPr>
+          <w:sz w:val="28"/>
+          <w:szCs w:val="28"/>
+        </w:rPr>
+      </w:pPr>
+      <w:r>
+        <w:rPr>
+          <w:sz w:val="28"/>
+          <w:szCs w:val="28"/>
+        </w:rPr>
+        <w:t>After completing configuration in the setup tab, r</w:t>
+      </w:r>
+      <w:r>
+        <w:rPr>
+          <w:sz w:val="28"/>
+          <w:szCs w:val="28"/>
+        </w:rPr>
+        <w:t>estart the application and select either the ‘Area Search Session Tab’ or ‘Trailing Session Tab’ as needed.</w:t>
+      </w:r>
+    </w:p>
+    <w:p>
+      <w:pPr>
+        <w:pStyle w:val="ListParagraph"/>
+        <w:numPr>
+          <w:ilvl w:val="1"/>
+          <w:numId w:val="2"/>
+        </w:numPr>
+        <w:jc w:val="both"/>
+        <w:rPr>
+          <w:sz w:val="28"/>
+          <w:szCs w:val="28"/>
+        </w:rPr>
+      </w:pPr>
+      <w:r>
+        <w:rPr>
+          <w:sz w:val="28"/>
+          <w:szCs w:val="28"/>
+        </w:rPr>
+        <w:t xml:space="preserve">Notice that some fields have white backgrounds while others are light-grey. White fields can </w:t>
+      </w:r>
+      <w:r>
+        <w:rPr>
+          <w:sz w:val="28"/>
+          <w:szCs w:val="28"/>
+        </w:rPr>
+        <w:t>generally</w:t>
+      </w:r>
+      <w:r>
+        <w:rPr>
+          <w:sz w:val="28"/>
+          <w:szCs w:val="28"/>
+        </w:rPr>
+        <w:t xml:space="preserve"> have free text entered while light grey windows must use the dropdown by clicking the \N{</w:t>
+      </w:r>
+      <w:r>
+        <w:rPr>
+          <w:sz w:val="28"/>
+          <w:szCs w:val="28"/>
+        </w:rPr>
+        <w:t xml:space="preserve">Modifier Letter </w:t>
+      </w:r>
+      <w:r>
+        <w:rPr>
+          <w:sz w:val="28"/>
+          <w:szCs w:val="28"/>
+        </w:rPr>
+        <w:t>Down Arrowhead} on the right side of the entry. A few of the white entry fields also have a \N{Modifier Letter Down Arrowhead} which for common entries.</w:t>
+      </w:r>
+    </w:p>
+    <w:p>
+      <w:pPr>
+        <w:pStyle w:val="ListParagraph"/>
+        <w:numPr>
+          <w:ilvl w:val="1"/>
+          <w:numId w:val="2"/>
+        </w:numPr>
+        <w:jc w:val="both"/>
+        <w:rPr>
+          <w:sz w:val="28"/>
+          <w:szCs w:val="28"/>
+        </w:rPr>
+      </w:pPr>
+      <w:r>
+        <w:rPr>
+          <w:sz w:val="28"/>
+          <w:szCs w:val="28"/>
+        </w:rPr>
+        <w:t xml:space="preserve">Start Time and Finish Time entries are unique </w:t>
+      </w:r>
+      <w:r>
+        <w:rPr>
+          <w:sz w:val="28"/>
+          <w:szCs w:val="28"/>
+        </w:rPr>
+        <w:t>–</w:t>
+      </w:r>
+      <w:r>
+        <w:rPr>
+          <w:sz w:val="28"/>
+          <w:szCs w:val="28"/>
+        </w:rPr>
+        <w:t xml:space="preserve"> </w:t>
+      </w:r>
+      <w:r>
+        <w:rPr>
+          <w:sz w:val="28"/>
+          <w:szCs w:val="28"/>
+        </w:rPr>
+        <w:t xml:space="preserve">hover the mouse over the left half and rotate the mouse scroll wheel to change the hour.  Hover over the right side to adjust the minutes.  The time is recorded in </w:t>
+      </w:r>
+      <w:r>
+        <w:rPr>
+          <w:sz w:val="28"/>
+          <w:szCs w:val="28"/>
+        </w:rPr>
+        <w:t>24-hour</w:t>
+      </w:r>
+      <w:r>
+        <w:rPr>
+          <w:sz w:val="28"/>
+          <w:szCs w:val="28"/>
+        </w:rPr>
+        <w:t xml:space="preserve"> Military time to avoid confusion.</w:t>
+      </w:r>
+      <w:r>
+        <w:rPr>
+          <w:sz w:val="28"/>
+          <w:szCs w:val="28"/>
+        </w:rPr>
+        <w:t xml:space="preserve"> Light grey in the time entry implies that no time is selected.  If a time is accidentally entered, double-click over the colon ‘:’ in that entry to unset it.</w:t>
       </w:r>
     </w:p>
     <w:p>
@@ -314,103 +522,262 @@
           <w:ilvl w:val="0"/>
           <w:numId w:val="2"/>
         </w:numPr>
-        <w:rPr>
-          <w:sz w:val="28"/>
-          <w:szCs w:val="28"/>
-        </w:rPr>
-      </w:pPr>
-      <w:r>
-        <w:rPr>
-          <w:sz w:val="28"/>
-          <w:szCs w:val="28"/>
-        </w:rPr>
-        <w:t>Notice that some fields have white backgrounds while others are light-grey. White fields can always have free text entered while light grey windows must use the dropdown by clicking the \N{</w:t>
-      </w:r>
-      <w:r>
-        <w:rPr>
-          <w:sz w:val="28"/>
-          <w:szCs w:val="28"/>
-        </w:rPr>
-        <w:t xml:space="preserve">Modifier Letter </w:t>
-      </w:r>
-      <w:r>
-        <w:rPr>
-          <w:sz w:val="28"/>
-          <w:szCs w:val="28"/>
-        </w:rPr>
-        <w:t>Down Arrowhead} on the right side of the entry. A few of the white entry fields also have a \N{Modifier Letter Down Arrowhead} which for common entries.</w:t>
-      </w:r>
-    </w:p>
-    <w:p>
-      <w:pPr>
-        <w:pStyle w:val="ListParagraph"/>
-        <w:numPr>
-          <w:ilvl w:val="0"/>
+        <w:jc w:val="both"/>
+        <w:rPr>
+          <w:sz w:val="28"/>
+          <w:szCs w:val="28"/>
+        </w:rPr>
+      </w:pPr>
+      <w:r>
+        <w:rPr>
+          <w:sz w:val="28"/>
+          <w:szCs w:val="28"/>
+        </w:rPr>
+        <w:t xml:space="preserve">Data entry of some of the fields </w:t>
+      </w:r>
+      <w:r>
+        <w:rPr>
+          <w:sz w:val="28"/>
+          <w:szCs w:val="28"/>
+        </w:rPr>
+        <w:t>is not obvious.</w:t>
+      </w:r>
+    </w:p>
+    <w:p>
+      <w:pPr>
+        <w:pStyle w:val="ListParagraph"/>
+        <w:numPr>
+          <w:ilvl w:val="1"/>
           <w:numId w:val="2"/>
         </w:numPr>
-        <w:rPr>
-          <w:sz w:val="28"/>
-          <w:szCs w:val="28"/>
-        </w:rPr>
-      </w:pPr>
-      <w:r>
-        <w:rPr>
-          <w:sz w:val="28"/>
-          <w:szCs w:val="28"/>
-        </w:rPr>
-        <w:t xml:space="preserve">Start Time and Finish Time entries are unique </w:t>
-      </w:r>
-      <w:r>
-        <w:rPr>
-          <w:sz w:val="28"/>
-          <w:szCs w:val="28"/>
-        </w:rPr>
-        <w:t>–</w:t>
-      </w:r>
-      <w:r>
-        <w:rPr>
-          <w:sz w:val="28"/>
-          <w:szCs w:val="28"/>
-        </w:rPr>
-        <w:t xml:space="preserve"> </w:t>
-      </w:r>
-      <w:r>
-        <w:rPr>
-          <w:sz w:val="28"/>
-          <w:szCs w:val="28"/>
-        </w:rPr>
-        <w:t xml:space="preserve">hover the mouse over the left half and rotate the mouse scroll wheel to change the hour.  Hover over the right side to adjust the minutes.  The time is recorded in </w:t>
-      </w:r>
-      <w:r>
-        <w:rPr>
-          <w:sz w:val="28"/>
-          <w:szCs w:val="28"/>
-        </w:rPr>
-        <w:t>24-hour</w:t>
-      </w:r>
-      <w:r>
-        <w:rPr>
-          <w:sz w:val="28"/>
-          <w:szCs w:val="28"/>
-        </w:rPr>
-        <w:t xml:space="preserve"> Military time to avoid confusion.</w:t>
-      </w:r>
-    </w:p>
-    <w:p>
-      <w:pPr>
-        <w:pStyle w:val="ListParagraph"/>
-        <w:numPr>
-          <w:ilvl w:val="0"/>
+        <w:jc w:val="both"/>
+        <w:rPr>
+          <w:sz w:val="28"/>
+          <w:szCs w:val="28"/>
+        </w:rPr>
+      </w:pPr>
+      <w:r>
+        <w:rPr>
+          <w:sz w:val="28"/>
+          <w:szCs w:val="28"/>
+        </w:rPr>
+        <w:t xml:space="preserve">‘Add Session Purpose’ and ‘Session Purposes’ – these are paired fields that can accumulate multiple training purposes. </w:t>
+      </w:r>
+    </w:p>
+    <w:p>
+      <w:pPr>
+        <w:pStyle w:val="ListParagraph"/>
+        <w:numPr>
+          <w:ilvl w:val="2"/>
           <w:numId w:val="2"/>
         </w:numPr>
-        <w:rPr>
-          <w:sz w:val="28"/>
-          <w:szCs w:val="28"/>
-        </w:rPr>
-      </w:pPr>
-    </w:p>
-    <w:p>
-      <w:pPr>
+        <w:jc w:val="both"/>
+        <w:rPr>
+          <w:sz w:val="28"/>
+          <w:szCs w:val="28"/>
+        </w:rPr>
+      </w:pPr>
+      <w:r>
+        <w:rPr>
+          <w:sz w:val="28"/>
+          <w:szCs w:val="28"/>
+        </w:rPr>
+        <w:t>‘Add Session Purpose’ – selects one purpose at a time to be added to accumulated purposes.  One can either use the dropdown list or type in a custom purpose followed by ‘Enter.’</w:t>
+      </w:r>
+    </w:p>
+    <w:p>
+      <w:pPr>
+        <w:pStyle w:val="ListParagraph"/>
+        <w:numPr>
+          <w:ilvl w:val="2"/>
+          <w:numId w:val="2"/>
+        </w:numPr>
+        <w:jc w:val="both"/>
+        <w:rPr>
+          <w:sz w:val="28"/>
+          <w:szCs w:val="28"/>
+        </w:rPr>
+      </w:pPr>
+      <w:r>
+        <w:rPr>
+          <w:sz w:val="28"/>
+          <w:szCs w:val="28"/>
+        </w:rPr>
+        <w:t>‘Session Purposes’ – is the list of all purposes of this training session.  If a purpose is added by mistake, simply double-click that entry to remove it.</w:t>
+      </w:r>
+    </w:p>
+    <w:p>
+      <w:pPr>
+        <w:pStyle w:val="ListParagraph"/>
+        <w:numPr>
+          <w:ilvl w:val="1"/>
+          <w:numId w:val="2"/>
+        </w:numPr>
+        <w:jc w:val="both"/>
+        <w:rPr>
+          <w:sz w:val="28"/>
+          <w:szCs w:val="28"/>
+        </w:rPr>
+      </w:pPr>
+      <w:r>
+        <w:rPr>
+          <w:sz w:val="28"/>
+          <w:szCs w:val="28"/>
+        </w:rPr>
+        <w:t>‘Add Terrain Type’ and ‘Accumulated Terrains’ behave in the same manner as the Session Purpose pair described above.</w:t>
+      </w:r>
+    </w:p>
+    <w:p>
+      <w:pPr>
+        <w:pStyle w:val="ListParagraph"/>
+        <w:numPr>
+          <w:ilvl w:val="1"/>
+          <w:numId w:val="2"/>
+        </w:numPr>
+        <w:jc w:val="both"/>
+        <w:rPr>
+          <w:sz w:val="28"/>
+          <w:szCs w:val="28"/>
+        </w:rPr>
+      </w:pPr>
+      <w:r>
+        <w:rPr>
+          <w:sz w:val="28"/>
+          <w:szCs w:val="28"/>
+        </w:rPr>
+        <w:lastRenderedPageBreak/>
+        <w:t xml:space="preserve">On the Area Search Training Session Tab </w:t>
+      </w:r>
+      <w:r>
+        <w:rPr>
+          <w:sz w:val="28"/>
+          <w:szCs w:val="28"/>
+        </w:rPr>
+        <w:t xml:space="preserve">‘Number of Subjects’, ‘Subjects Found’ and the table to the right of ‘Subjects Found’ work in tandem.  Notice that ‘Subjects Found’ is disabled until the number of subjects is entered.  Once that is done select the number of subjects found which enables the table to the right.  For each subject found a single click under the heading ‘Indication on Initial Find’ or ‘Indication on Refind’ presents a dropdown box to fill in the </w:t>
+      </w:r>
+      <w:r>
+        <w:rPr>
+          <w:sz w:val="28"/>
+          <w:szCs w:val="28"/>
+        </w:rPr>
+        <w:t>dog’s action.</w:t>
+      </w:r>
+    </w:p>
+    <w:p>
+      <w:pPr>
+        <w:pStyle w:val="ListParagraph"/>
+        <w:numPr>
+          <w:ilvl w:val="1"/>
+          <w:numId w:val="2"/>
+        </w:numPr>
+        <w:jc w:val="both"/>
+        <w:rPr>
+          <w:sz w:val="28"/>
+          <w:szCs w:val="28"/>
+        </w:rPr>
+      </w:pPr>
+      <w:r>
+        <w:rPr>
+          <w:sz w:val="28"/>
+          <w:szCs w:val="28"/>
+        </w:rPr>
+        <w:t>On the Trailing Training Session tab find three linked entries in the box labeled ‘Distractions.’  First select the desired distraction, then select response. One can either use the dropdown list or type in a custom answer.  If typing a custom response, that entry must be registered by typing ‘Enter’.  Notice that the pair will then present in the ‘Accumulated Distractions’ table.  If not satisfied with an entry, it can be selected by hovering over the desired entry and clicking the mouse. Note that the ‘Distraction’ and ‘Response’ fields list that entry and may now be edited. If only the ‘Distraction’ entry is modified, click ‘Update’ to register that change.</w:t>
+      </w:r>
+      <w:r>
+        <w:rPr>
+          <w:sz w:val="28"/>
+          <w:szCs w:val="28"/>
+        </w:rPr>
+        <w:t xml:space="preserve"> Editing the ‘Response’ updates automatically.</w:t>
+      </w:r>
+    </w:p>
+    <w:p>
+      <w:pPr>
+        <w:pStyle w:val="ListParagraph"/>
+        <w:numPr>
+          <w:ilvl w:val="1"/>
+          <w:numId w:val="2"/>
+        </w:numPr>
+        <w:jc w:val="both"/>
+        <w:rPr>
+          <w:sz w:val="28"/>
+          <w:szCs w:val="28"/>
+        </w:rPr>
+      </w:pPr>
+      <w:r>
+        <w:rPr>
+          <w:sz w:val="28"/>
+          <w:szCs w:val="28"/>
+        </w:rPr>
+        <w:t>Images – usually photos or maps can be added either by browsing to the desired file or using Windows drag and drop.</w:t>
+      </w:r>
+    </w:p>
+    <w:p>
+      <w:pPr>
+        <w:pStyle w:val="ListParagraph"/>
+        <w:numPr>
+          <w:ilvl w:val="1"/>
+          <w:numId w:val="2"/>
+        </w:numPr>
+        <w:jc w:val="both"/>
+        <w:rPr>
+          <w:sz w:val="28"/>
+          <w:szCs w:val="28"/>
+        </w:rPr>
+      </w:pPr>
+      <w:r>
+        <w:rPr>
+          <w:sz w:val="28"/>
+          <w:szCs w:val="28"/>
+        </w:rPr>
+        <w:t>‘View/Edit/Hide Prior Sessions(s) – This can be useful if the user discovers that a prior session needs to be updated.</w:t>
+      </w:r>
+    </w:p>
+    <w:p>
+      <w:pPr>
+        <w:pStyle w:val="ListParagraph"/>
+        <w:numPr>
+          <w:ilvl w:val="1"/>
+          <w:numId w:val="2"/>
+        </w:numPr>
+        <w:jc w:val="both"/>
+        <w:rPr>
+          <w:sz w:val="28"/>
+          <w:szCs w:val="28"/>
+        </w:rPr>
+      </w:pPr>
+      <w:r>
+        <w:rPr>
+          <w:sz w:val="28"/>
+          <w:szCs w:val="28"/>
+        </w:rPr>
+        <w:t>The user has the ability to hide a session.  This function is in  lieu of a delete function which would be permanent and could lead to irreversible errors. When in view mode simply click ‘Hide.’ Hidden sessions can be selected from the View/Edit/Hide window using the radio buttons at the bottom of the form.</w:t>
+      </w:r>
+    </w:p>
+    <w:p>
+      <w:pPr>
+        <w:pStyle w:val="ListParagraph"/>
+        <w:numPr>
+          <w:ilvl w:val="1"/>
+          <w:numId w:val="2"/>
+        </w:numPr>
+        <w:jc w:val="both"/>
+        <w:rPr>
+          <w:sz w:val="28"/>
+          <w:szCs w:val="28"/>
+        </w:rPr>
+      </w:pPr>
+      <w:r>
+        <w:rPr>
+          <w:sz w:val="28"/>
+          <w:szCs w:val="28"/>
+        </w:rPr>
+        <w:t>‘Export PDF’ – generates human readable logs for review by team members or for certification.</w:t>
+      </w:r>
+    </w:p>
+    <w:p>
+      <w:pPr>
+        <w:jc w:val="both"/>
         <w:rPr>
           <w:sz w:val="28"/>
           <w:szCs w:val="28"/>
@@ -534,7 +901,7 @@
         <w:rFonts w:hint="default"/>
       </w:rPr>
     </w:lvl>
-    <w:lvl w:ilvl="1" w:tplc="04090019" w:tentative="1">
+    <w:lvl w:ilvl="1" w:tplc="04090019">
       <w:start w:val="1"/>
       <w:numFmt w:val="lowerLetter"/>
       <w:lvlText w:val="%2."/>
@@ -543,7 +910,7 @@
         <w:ind w:left="1440" w:hanging="360"/>
       </w:pPr>
     </w:lvl>
-    <w:lvl w:ilvl="2" w:tplc="0409001B" w:tentative="1">
+    <w:lvl w:ilvl="2" w:tplc="0409001B">
       <w:start w:val="1"/>
       <w:numFmt w:val="lowerRoman"/>
       <w:lvlText w:val="%3."/>

</xml_diff>

<commit_message>
Added some tooltips, help file generator and updated help file
</commit_message>
<xml_diff>
--- a/SAR K9 Training Record User Manual.docx
+++ b/SAR K9 Training Record User Manual.docx
@@ -5,11 +5,16 @@
     <w:p>
       <w:pPr>
         <w:pStyle w:val="Heading1"/>
-        <w:jc w:val="center"/>
       </w:pPr>
       <w:r>
         <w:t>SAR K9 Training Record</w:t>
       </w:r>
+      <w:r>
+        <w:t xml:space="preserve"> </w:t>
+      </w:r>
+      <w:r>
+        <w:t>Introduction</w:t>
+      </w:r>
     </w:p>
     <w:p>
       <w:pPr>
@@ -24,7 +29,7 @@
           <w:sz w:val="28"/>
           <w:szCs w:val="28"/>
         </w:rPr>
-        <w:t>Preface: This is a preliminary help file to get the user started.  This window can always be viewed by pushing F1 on your keyboard.</w:t>
+        <w:t>This is a preliminary help file to get the user started.  This window can always be viewed by pushing F1 on your keyboard.</w:t>
       </w:r>
       <w:r>
         <w:rPr>
@@ -36,18 +41,10 @@
     </w:p>
     <w:p>
       <w:pPr>
-        <w:jc w:val="both"/>
-        <w:rPr>
-          <w:sz w:val="28"/>
-          <w:szCs w:val="28"/>
-        </w:rPr>
-      </w:pPr>
-      <w:r>
-        <w:rPr>
-          <w:sz w:val="28"/>
-          <w:szCs w:val="28"/>
-        </w:rPr>
-        <w:t>Chapter 1 – Setup</w:t>
+        <w:pStyle w:val="Heading1"/>
+      </w:pPr>
+      <w:r>
+        <w:t>Setup</w:t>
       </w:r>
     </w:p>
     <w:p>
@@ -68,7 +65,37 @@
           <w:sz w:val="28"/>
           <w:szCs w:val="28"/>
         </w:rPr>
-        <w:t xml:space="preserve">Select the primary storage folder.  The database and configuration files are saved here.  Browse to the location you wish to save this data.  On a modern Windows machine placing the folder either on a path included in Microsoft OneDrive or a </w:t>
+        <w:t xml:space="preserve">Select the primary storage folder.  The database and configuration files are saved here.  </w:t>
+      </w:r>
+      <w:r>
+        <w:rPr>
+          <w:sz w:val="28"/>
+          <w:szCs w:val="28"/>
+        </w:rPr>
+        <w:t xml:space="preserve">Click the </w:t>
+      </w:r>
+      <w:r>
+        <w:rPr>
+          <w:b/>
+          <w:bCs/>
+          <w:sz w:val="28"/>
+          <w:szCs w:val="28"/>
+        </w:rPr>
+        <w:t>Browse</w:t>
+      </w:r>
+      <w:r>
+        <w:rPr>
+          <w:sz w:val="28"/>
+          <w:szCs w:val="28"/>
+        </w:rPr>
+        <w:t xml:space="preserve"> button and navigate</w:t>
+      </w:r>
+      <w:r>
+        <w:rPr>
+          <w:sz w:val="28"/>
+          <w:szCs w:val="28"/>
+        </w:rPr>
+        <w:t xml:space="preserve"> to the location you wish to save this data.  On a modern Windows machine placing the folder either on a path included in Microsoft OneDrive or a </w:t>
       </w:r>
       <w:r>
         <w:rPr>
@@ -103,7 +130,23 @@
           <w:sz w:val="28"/>
           <w:szCs w:val="28"/>
         </w:rPr>
-        <w:t xml:space="preserve">Click on ‘Initialize Data Structures’ which creates an empty database. </w:t>
+        <w:t xml:space="preserve">Click </w:t>
+      </w:r>
+      <w:r>
+        <w:rPr>
+          <w:b/>
+          <w:bCs/>
+          <w:sz w:val="28"/>
+          <w:szCs w:val="28"/>
+        </w:rPr>
+        <w:t>on Initialize Data Structures</w:t>
+      </w:r>
+      <w:r>
+        <w:rPr>
+          <w:sz w:val="28"/>
+          <w:szCs w:val="28"/>
+        </w:rPr>
+        <w:t xml:space="preserve"> which creates an empty database. </w:t>
       </w:r>
     </w:p>
     <w:p>
@@ -124,7 +167,14 @@
           <w:sz w:val="28"/>
           <w:szCs w:val="28"/>
         </w:rPr>
-        <w:t>Select a backup folder.  While optional, it is STRONGLY recommended to configure this.  Ideally, this folder should reside on an external hard drive or another service such as Google Drive</w:t>
+        <w:t>In a similar manner s</w:t>
+      </w:r>
+      <w:r>
+        <w:rPr>
+          <w:sz w:val="28"/>
+          <w:szCs w:val="28"/>
+        </w:rPr>
+        <w:t>elect a backup folder.  While optional, it is STRONGLY recommended to configure this.  Ideally, this folder should reside on an external hard drive or another service such as Google Drive</w:t>
       </w:r>
       <w:r>
         <w:rPr>
@@ -189,6 +239,20 @@
         </w:rPr>
         <w:t>Configure a folder for Excel compatible data files.</w:t>
       </w:r>
+      <w:r>
+        <w:rPr>
+          <w:sz w:val="28"/>
+          <w:szCs w:val="28"/>
+        </w:rPr>
+        <w:t xml:space="preserve"> While these files can be edited and used to update the database, </w:t>
+      </w:r>
+      <w:r>
+        <w:rPr>
+          <w:sz w:val="28"/>
+          <w:szCs w:val="28"/>
+        </w:rPr>
+        <w:t>no error checking is performed on those updates so any mistake in editing could corrupt the database.</w:t>
+      </w:r>
     </w:p>
     <w:p>
       <w:pPr>
@@ -222,7 +286,39 @@
           <w:sz w:val="28"/>
           <w:szCs w:val="28"/>
         </w:rPr>
-        <w:t xml:space="preserve"> either type in the name followed by ‘Enter’ or click the ‘Add Location’ button.</w:t>
+        <w:t xml:space="preserve"> either type in the name followed by </w:t>
+      </w:r>
+      <w:r>
+        <w:rPr>
+          <w:b/>
+          <w:bCs/>
+          <w:sz w:val="28"/>
+          <w:szCs w:val="28"/>
+        </w:rPr>
+        <w:t>Enter</w:t>
+      </w:r>
+      <w:r>
+        <w:rPr>
+          <w:sz w:val="28"/>
+          <w:szCs w:val="28"/>
+        </w:rPr>
+        <w:t xml:space="preserve"> or click the </w:t>
+      </w:r>
+      <w:r>
+        <w:rPr>
+          <w:b/>
+          <w:bCs/>
+          <w:sz w:val="28"/>
+          <w:szCs w:val="28"/>
+        </w:rPr>
+        <w:t>Add Location</w:t>
+      </w:r>
+      <w:r>
+        <w:rPr>
+          <w:sz w:val="28"/>
+          <w:szCs w:val="28"/>
+        </w:rPr>
+        <w:t xml:space="preserve"> button.</w:t>
       </w:r>
     </w:p>
     <w:p>
@@ -245,6 +341,13 @@
         </w:rPr>
         <w:t>Dog names are entered in an identical manner.  Unlike location names, however, all dogs that are to be recorded must be entered here.</w:t>
       </w:r>
+      <w:r>
+        <w:rPr>
+          <w:sz w:val="28"/>
+          <w:szCs w:val="28"/>
+        </w:rPr>
+        <w:t xml:space="preserve"> Once used in a session, never delete or alter a dog name since it is possible to lose access to any sessions using a different name.</w:t>
+      </w:r>
     </w:p>
     <w:p>
       <w:pPr>
@@ -261,10 +364,54 @@
       </w:pPr>
       <w:r>
         <w:rPr>
-          <w:sz w:val="28"/>
-          <w:szCs w:val="28"/>
-        </w:rPr>
-        <w:t xml:space="preserve">Terrain Types and Distraction types are entered in a similar manner.  The user can adjust the order they appear in the table as desired. </w:t>
+          <w:b/>
+          <w:bCs/>
+          <w:sz w:val="28"/>
+          <w:szCs w:val="28"/>
+        </w:rPr>
+        <w:lastRenderedPageBreak/>
+        <w:t>Terrain Types</w:t>
+      </w:r>
+      <w:r>
+        <w:rPr>
+          <w:sz w:val="28"/>
+          <w:szCs w:val="28"/>
+        </w:rPr>
+        <w:t xml:space="preserve"> and </w:t>
+      </w:r>
+      <w:r>
+        <w:rPr>
+          <w:b/>
+          <w:bCs/>
+          <w:sz w:val="28"/>
+          <w:szCs w:val="28"/>
+        </w:rPr>
+        <w:t xml:space="preserve">Distraction </w:t>
+      </w:r>
+      <w:r>
+        <w:rPr>
+          <w:b/>
+          <w:bCs/>
+          <w:sz w:val="28"/>
+          <w:szCs w:val="28"/>
+        </w:rPr>
+        <w:t>T</w:t>
+      </w:r>
+      <w:r>
+        <w:rPr>
+          <w:b/>
+          <w:bCs/>
+          <w:sz w:val="28"/>
+          <w:szCs w:val="28"/>
+        </w:rPr>
+        <w:t>ypes</w:t>
+      </w:r>
+      <w:r>
+        <w:rPr>
+          <w:sz w:val="28"/>
+          <w:szCs w:val="28"/>
+        </w:rPr>
+        <w:t xml:space="preserve"> are entered in a similar manner.  The user can adjust the order they appear in the table as desired. </w:t>
       </w:r>
       <w:r>
         <w:rPr>
@@ -299,8 +446,23 @@
           <w:sz w:val="28"/>
           <w:szCs w:val="28"/>
         </w:rPr>
-        <w:lastRenderedPageBreak/>
-        <w:t>Now click ‘Save Configuration’ then exit the program (using the</w:t>
+        <w:t xml:space="preserve">Now click </w:t>
+      </w:r>
+      <w:r>
+        <w:rPr>
+          <w:b/>
+          <w:bCs/>
+          <w:sz w:val="28"/>
+          <w:szCs w:val="28"/>
+        </w:rPr>
+        <w:t>Save Configuration</w:t>
+      </w:r>
+      <w:r>
+        <w:rPr>
+          <w:sz w:val="28"/>
+          <w:szCs w:val="28"/>
+        </w:rPr>
+        <w:t xml:space="preserve"> then exit the program (using the</w:t>
       </w:r>
       <w:r>
         <w:rPr>
@@ -340,18 +502,10 @@
     </w:p>
     <w:p>
       <w:pPr>
-        <w:jc w:val="both"/>
-        <w:rPr>
-          <w:sz w:val="28"/>
-          <w:szCs w:val="28"/>
-        </w:rPr>
-      </w:pPr>
-      <w:r>
-        <w:rPr>
-          <w:sz w:val="28"/>
-          <w:szCs w:val="28"/>
-        </w:rPr>
-        <w:t>Chapter 2 – Usage</w:t>
+        <w:pStyle w:val="Heading1"/>
+      </w:pPr>
+      <w:r>
+        <w:t>Usage</w:t>
       </w:r>
     </w:p>
     <w:p>
@@ -372,7 +526,225 @@
           <w:sz w:val="28"/>
           <w:szCs w:val="28"/>
         </w:rPr>
-        <w:t>General</w:t>
+        <w:t xml:space="preserve">Notice that some fields have white backgrounds while others are </w:t>
+      </w:r>
+      <w:r>
+        <w:rPr>
+          <w:sz w:val="28"/>
+          <w:szCs w:val="28"/>
+        </w:rPr>
+        <w:t>light grey</w:t>
+      </w:r>
+      <w:r>
+        <w:rPr>
+          <w:sz w:val="28"/>
+          <w:szCs w:val="28"/>
+        </w:rPr>
+        <w:t xml:space="preserve">. White fields can </w:t>
+      </w:r>
+      <w:r>
+        <w:rPr>
+          <w:sz w:val="28"/>
+          <w:szCs w:val="28"/>
+        </w:rPr>
+        <w:t>generally</w:t>
+      </w:r>
+      <w:r>
+        <w:rPr>
+          <w:sz w:val="28"/>
+          <w:szCs w:val="28"/>
+        </w:rPr>
+        <w:t xml:space="preserve"> have free text entered while light</w:t>
+      </w:r>
+      <w:r>
+        <w:rPr>
+          <w:sz w:val="28"/>
+          <w:szCs w:val="28"/>
+        </w:rPr>
+        <w:t>-</w:t>
+      </w:r>
+      <w:r>
+        <w:rPr>
+          <w:sz w:val="28"/>
+          <w:szCs w:val="28"/>
+        </w:rPr>
+        <w:t>grey windows must use the dropdown by clicking the \N{</w:t>
+      </w:r>
+      <w:r>
+        <w:rPr>
+          <w:sz w:val="28"/>
+          <w:szCs w:val="28"/>
+        </w:rPr>
+        <w:t xml:space="preserve">Modifier Letter </w:t>
+      </w:r>
+      <w:r>
+        <w:rPr>
+          <w:sz w:val="28"/>
+          <w:szCs w:val="28"/>
+        </w:rPr>
+        <w:t xml:space="preserve">Down Arrowhead} </w:t>
+      </w:r>
+      <w:r>
+        <w:rPr>
+          <w:sz w:val="28"/>
+          <w:szCs w:val="28"/>
+        </w:rPr>
+        <w:t xml:space="preserve">or \N{Black Down-Pointing Triangle} </w:t>
+      </w:r>
+      <w:r>
+        <w:rPr>
+          <w:sz w:val="28"/>
+          <w:szCs w:val="28"/>
+        </w:rPr>
+        <w:t xml:space="preserve">on the right side of the entry. A few of the white entry fields also have a \N{Modifier Letter Down Arrowhead} </w:t>
+      </w:r>
+      <w:r>
+        <w:rPr>
+          <w:sz w:val="28"/>
+          <w:szCs w:val="28"/>
+        </w:rPr>
+        <w:t>or \N{Black Down-Pointing Triangle}</w:t>
+      </w:r>
+      <w:r>
+        <w:rPr>
+          <w:sz w:val="28"/>
+          <w:szCs w:val="28"/>
+        </w:rPr>
+        <w:t xml:space="preserve"> for common entries.</w:t>
+      </w:r>
+    </w:p>
+    <w:p>
+      <w:pPr>
+        <w:pStyle w:val="ListParagraph"/>
+        <w:numPr>
+          <w:ilvl w:val="0"/>
+          <w:numId w:val="2"/>
+        </w:numPr>
+        <w:jc w:val="both"/>
+        <w:rPr>
+          <w:sz w:val="28"/>
+          <w:szCs w:val="28"/>
+        </w:rPr>
+      </w:pPr>
+      <w:r>
+        <w:rPr>
+          <w:b/>
+          <w:bCs/>
+          <w:sz w:val="28"/>
+          <w:szCs w:val="28"/>
+        </w:rPr>
+        <w:t>Start Time and Finish Time entries</w:t>
+      </w:r>
+      <w:r>
+        <w:rPr>
+          <w:sz w:val="28"/>
+          <w:szCs w:val="28"/>
+        </w:rPr>
+        <w:t xml:space="preserve"> </w:t>
+      </w:r>
+      <w:r>
+        <w:rPr>
+          <w:sz w:val="28"/>
+          <w:szCs w:val="28"/>
+        </w:rPr>
+        <w:t>–</w:t>
+      </w:r>
+      <w:r>
+        <w:rPr>
+          <w:sz w:val="28"/>
+          <w:szCs w:val="28"/>
+        </w:rPr>
+        <w:t xml:space="preserve"> </w:t>
+      </w:r>
+      <w:r>
+        <w:rPr>
+          <w:sz w:val="28"/>
+          <w:szCs w:val="28"/>
+        </w:rPr>
+        <w:t xml:space="preserve">hover the mouse over the left half and rotate the mouse scroll wheel to change the hour.  Hover over the right side to adjust the minutes.  The time is recorded in </w:t>
+      </w:r>
+      <w:r>
+        <w:rPr>
+          <w:sz w:val="28"/>
+          <w:szCs w:val="28"/>
+        </w:rPr>
+        <w:t>24-hour</w:t>
+      </w:r>
+      <w:r>
+        <w:rPr>
+          <w:sz w:val="28"/>
+          <w:szCs w:val="28"/>
+        </w:rPr>
+        <w:t xml:space="preserve"> Military time to avoid confusion.</w:t>
+      </w:r>
+      <w:r>
+        <w:rPr>
+          <w:sz w:val="28"/>
+          <w:szCs w:val="28"/>
+        </w:rPr>
+        <w:t xml:space="preserve"> Light grey in the time entry implies that no time is selected.  If a time is accidentally entered, double-click over the colon ‘:’ in that entry to unset it.</w:t>
+      </w:r>
+    </w:p>
+    <w:p>
+      <w:pPr>
+        <w:pStyle w:val="ListParagraph"/>
+        <w:numPr>
+          <w:ilvl w:val="0"/>
+          <w:numId w:val="2"/>
+        </w:numPr>
+        <w:jc w:val="both"/>
+        <w:rPr>
+          <w:sz w:val="28"/>
+          <w:szCs w:val="28"/>
+        </w:rPr>
+      </w:pPr>
+      <w:r>
+        <w:rPr>
+          <w:b/>
+          <w:bCs/>
+          <w:sz w:val="28"/>
+          <w:szCs w:val="28"/>
+        </w:rPr>
+        <w:t xml:space="preserve">Add Session Purpose </w:t>
+      </w:r>
+      <w:r>
+        <w:rPr>
+          <w:sz w:val="28"/>
+          <w:szCs w:val="28"/>
+        </w:rPr>
+        <w:t>and</w:t>
+      </w:r>
+      <w:r>
+        <w:rPr>
+          <w:b/>
+          <w:bCs/>
+          <w:sz w:val="28"/>
+          <w:szCs w:val="28"/>
+        </w:rPr>
+        <w:t xml:space="preserve"> Session</w:t>
+      </w:r>
+      <w:r>
+        <w:rPr>
+          <w:sz w:val="28"/>
+          <w:szCs w:val="28"/>
+        </w:rPr>
+        <w:t xml:space="preserve"> </w:t>
+      </w:r>
+      <w:r>
+        <w:rPr>
+          <w:b/>
+          <w:bCs/>
+          <w:sz w:val="28"/>
+          <w:szCs w:val="28"/>
+        </w:rPr>
+        <w:t>Purposes</w:t>
+      </w:r>
+      <w:r>
+        <w:rPr>
+          <w:sz w:val="28"/>
+          <w:szCs w:val="28"/>
+        </w:rPr>
+        <w:t xml:space="preserve"> – these are paired fields that can accumulate multiple training purposes. </w:t>
       </w:r>
     </w:p>
     <w:p>
@@ -390,17 +762,49 @@
       </w:pPr>
       <w:r>
         <w:rPr>
-          <w:sz w:val="28"/>
-          <w:szCs w:val="28"/>
-        </w:rPr>
-        <w:t>After completing configuration in the setup tab, r</w:t>
-      </w:r>
-      <w:r>
-        <w:rPr>
-          <w:sz w:val="28"/>
-          <w:szCs w:val="28"/>
-        </w:rPr>
-        <w:t>estart the application and select either the ‘Area Search Session Tab’ or ‘Trailing Session Tab’ as needed.</w:t>
+          <w:b/>
+          <w:bCs/>
+          <w:sz w:val="28"/>
+          <w:szCs w:val="28"/>
+        </w:rPr>
+        <w:t>Add Session Purpose</w:t>
+      </w:r>
+      <w:r>
+        <w:rPr>
+          <w:sz w:val="28"/>
+          <w:szCs w:val="28"/>
+        </w:rPr>
+        <w:t xml:space="preserve"> – selects one purpose at a time to be added to accumulated purposes.  </w:t>
+      </w:r>
+      <w:r>
+        <w:rPr>
+          <w:sz w:val="28"/>
+          <w:szCs w:val="28"/>
+        </w:rPr>
+        <w:t>Use</w:t>
+      </w:r>
+      <w:r>
+        <w:rPr>
+          <w:sz w:val="28"/>
+          <w:szCs w:val="28"/>
+        </w:rPr>
+        <w:t xml:space="preserve"> either use the dropdown list or type in a custom purpose followed by </w:t>
+      </w:r>
+      <w:r>
+        <w:rPr>
+          <w:b/>
+          <w:bCs/>
+          <w:sz w:val="28"/>
+          <w:szCs w:val="28"/>
+        </w:rPr>
+        <w:t>Enter</w:t>
+      </w:r>
+      <w:r>
+        <w:rPr>
+          <w:sz w:val="28"/>
+          <w:szCs w:val="28"/>
+        </w:rPr>
+        <w:t>.</w:t>
       </w:r>
     </w:p>
     <w:p>
@@ -418,101 +822,19 @@
       </w:pPr>
       <w:r>
         <w:rPr>
-          <w:sz w:val="28"/>
-          <w:szCs w:val="28"/>
-        </w:rPr>
-        <w:t xml:space="preserve">Notice that some fields have white backgrounds while others are light-grey. White fields can </w:t>
-      </w:r>
-      <w:r>
-        <w:rPr>
-          <w:sz w:val="28"/>
-          <w:szCs w:val="28"/>
-        </w:rPr>
-        <w:t>generally</w:t>
-      </w:r>
-      <w:r>
-        <w:rPr>
-          <w:sz w:val="28"/>
-          <w:szCs w:val="28"/>
-        </w:rPr>
-        <w:t xml:space="preserve"> have free text entered while light grey windows must use the dropdown by clicking the \N{</w:t>
-      </w:r>
-      <w:r>
-        <w:rPr>
-          <w:sz w:val="28"/>
-          <w:szCs w:val="28"/>
-        </w:rPr>
-        <w:t xml:space="preserve">Modifier Letter </w:t>
-      </w:r>
-      <w:r>
-        <w:rPr>
-          <w:sz w:val="28"/>
-          <w:szCs w:val="28"/>
-        </w:rPr>
-        <w:t>Down Arrowhead} on the right side of the entry. A few of the white entry fields also have a \N{Modifier Letter Down Arrowhead} which for common entries.</w:t>
-      </w:r>
-    </w:p>
-    <w:p>
-      <w:pPr>
-        <w:pStyle w:val="ListParagraph"/>
-        <w:numPr>
-          <w:ilvl w:val="1"/>
-          <w:numId w:val="2"/>
-        </w:numPr>
-        <w:jc w:val="both"/>
-        <w:rPr>
-          <w:sz w:val="28"/>
-          <w:szCs w:val="28"/>
-        </w:rPr>
-      </w:pPr>
-      <w:r>
-        <w:rPr>
-          <w:sz w:val="28"/>
-          <w:szCs w:val="28"/>
-        </w:rPr>
-        <w:t xml:space="preserve">Start Time and Finish Time entries are unique </w:t>
-      </w:r>
-      <w:r>
-        <w:rPr>
-          <w:sz w:val="28"/>
-          <w:szCs w:val="28"/>
-        </w:rPr>
-        <w:t>–</w:t>
-      </w:r>
-      <w:r>
-        <w:rPr>
-          <w:sz w:val="28"/>
-          <w:szCs w:val="28"/>
-        </w:rPr>
-        <w:t xml:space="preserve"> </w:t>
-      </w:r>
-      <w:r>
-        <w:rPr>
-          <w:sz w:val="28"/>
-          <w:szCs w:val="28"/>
-        </w:rPr>
-        <w:t xml:space="preserve">hover the mouse over the left half and rotate the mouse scroll wheel to change the hour.  Hover over the right side to adjust the minutes.  The time is recorded in </w:t>
-      </w:r>
-      <w:r>
-        <w:rPr>
-          <w:sz w:val="28"/>
-          <w:szCs w:val="28"/>
-        </w:rPr>
-        <w:t>24-hour</w:t>
-      </w:r>
-      <w:r>
-        <w:rPr>
-          <w:sz w:val="28"/>
-          <w:szCs w:val="28"/>
-        </w:rPr>
-        <w:t xml:space="preserve"> Military time to avoid confusion.</w:t>
-      </w:r>
-      <w:r>
-        <w:rPr>
-          <w:sz w:val="28"/>
-          <w:szCs w:val="28"/>
-        </w:rPr>
-        <w:t xml:space="preserve"> Light grey in the time entry implies that no time is selected.  If a time is accidentally entered, double-click over the colon ‘:’ in that entry to unset it.</w:t>
+          <w:b/>
+          <w:bCs/>
+          <w:sz w:val="28"/>
+          <w:szCs w:val="28"/>
+        </w:rPr>
+        <w:t>Session Purposes</w:t>
+      </w:r>
+      <w:r>
+        <w:rPr>
+          <w:sz w:val="28"/>
+          <w:szCs w:val="28"/>
+        </w:rPr>
+        <w:t xml:space="preserve"> – is the list of all purposes of this training session.  If a purpose is added by mistake, simply double-click that entry to remove it.</w:t>
       </w:r>
     </w:p>
     <w:p>
@@ -530,26 +852,54 @@
       </w:pPr>
       <w:r>
         <w:rPr>
-          <w:sz w:val="28"/>
-          <w:szCs w:val="28"/>
-        </w:rPr>
-        <w:t xml:space="preserve">Data entry of some of the fields </w:t>
-      </w:r>
-      <w:r>
-        <w:rPr>
-          <w:sz w:val="28"/>
-          <w:szCs w:val="28"/>
-        </w:rPr>
-        <w:t>is not obvious.</w:t>
-      </w:r>
-    </w:p>
-    <w:p>
-      <w:pPr>
-        <w:pStyle w:val="ListParagraph"/>
-        <w:numPr>
-          <w:ilvl w:val="1"/>
-          <w:numId w:val="2"/>
-        </w:numPr>
+          <w:b/>
+          <w:bCs/>
+          <w:sz w:val="28"/>
+          <w:szCs w:val="28"/>
+        </w:rPr>
+        <w:t xml:space="preserve">Add Terrain Type </w:t>
+      </w:r>
+      <w:r>
+        <w:rPr>
+          <w:sz w:val="28"/>
+          <w:szCs w:val="28"/>
+        </w:rPr>
+        <w:t>and</w:t>
+      </w:r>
+      <w:r>
+        <w:rPr>
+          <w:b/>
+          <w:bCs/>
+          <w:sz w:val="28"/>
+          <w:szCs w:val="28"/>
+        </w:rPr>
+        <w:t xml:space="preserve"> Accumulated Terrains</w:t>
+      </w:r>
+      <w:r>
+        <w:rPr>
+          <w:sz w:val="28"/>
+          <w:szCs w:val="28"/>
+        </w:rPr>
+        <w:t xml:space="preserve"> behave in the same manner as the Session Purpose pair described above.</w:t>
+      </w:r>
+    </w:p>
+    <w:p>
+      <w:pPr>
+        <w:pStyle w:val="Heading1"/>
+      </w:pPr>
+      <w:r>
+        <w:lastRenderedPageBreak/>
+        <w:t xml:space="preserve">Area Search Session Specific </w:t>
+      </w:r>
+      <w:r>
+        <w:t>I</w:t>
+      </w:r>
+      <w:r>
+        <w:t>tems</w:t>
+      </w:r>
+    </w:p>
+    <w:p>
+      <w:pPr>
         <w:jc w:val="both"/>
         <w:rPr>
           <w:sz w:val="28"/>
@@ -561,16 +911,76 @@
           <w:sz w:val="28"/>
           <w:szCs w:val="28"/>
         </w:rPr>
-        <w:t xml:space="preserve">‘Add Session Purpose’ and ‘Session Purposes’ – these are paired fields that can accumulate multiple training purposes. </w:t>
-      </w:r>
-    </w:p>
-    <w:p>
-      <w:pPr>
-        <w:pStyle w:val="ListParagraph"/>
-        <w:numPr>
-          <w:ilvl w:val="2"/>
-          <w:numId w:val="2"/>
-        </w:numPr>
+        <w:t xml:space="preserve">On the Area Search Training Session Tab </w:t>
+      </w:r>
+      <w:r>
+        <w:rPr>
+          <w:b/>
+          <w:bCs/>
+          <w:sz w:val="28"/>
+          <w:szCs w:val="28"/>
+        </w:rPr>
+        <w:t>Number of Subjects</w:t>
+      </w:r>
+      <w:r>
+        <w:rPr>
+          <w:b/>
+          <w:bCs/>
+          <w:sz w:val="28"/>
+          <w:szCs w:val="28"/>
+        </w:rPr>
+        <w:t>,</w:t>
+      </w:r>
+      <w:r>
+        <w:rPr>
+          <w:b/>
+          <w:bCs/>
+          <w:sz w:val="28"/>
+          <w:szCs w:val="28"/>
+        </w:rPr>
+        <w:t xml:space="preserve"> Subjects Found </w:t>
+      </w:r>
+      <w:r>
+        <w:rPr>
+          <w:sz w:val="28"/>
+          <w:szCs w:val="28"/>
+        </w:rPr>
+        <w:t xml:space="preserve">and the table to the right of </w:t>
+      </w:r>
+      <w:r>
+        <w:rPr>
+          <w:b/>
+          <w:bCs/>
+          <w:sz w:val="28"/>
+          <w:szCs w:val="28"/>
+        </w:rPr>
+        <w:t>Subjects Found</w:t>
+      </w:r>
+      <w:r>
+        <w:rPr>
+          <w:sz w:val="28"/>
+          <w:szCs w:val="28"/>
+        </w:rPr>
+        <w:t xml:space="preserve"> work in tandem.  Notice that ‘Subjects Found’ is disabled until the number of subjects is entered.  Once that is done select the number of subjects found which enables the table to the right.  For each subject found a single click under the heading ‘Indication on Initial Find’ or ‘Indication on Refind’ presents a dropdown box to fill in the </w:t>
+      </w:r>
+      <w:r>
+        <w:rPr>
+          <w:sz w:val="28"/>
+          <w:szCs w:val="28"/>
+        </w:rPr>
+        <w:t>dog’s action.</w:t>
+      </w:r>
+    </w:p>
+    <w:p>
+      <w:pPr>
+        <w:pStyle w:val="Heading1"/>
+      </w:pPr>
+      <w:r>
+        <w:t>Trailing Session Specific Items</w:t>
+      </w:r>
+    </w:p>
+    <w:p>
+      <w:pPr>
         <w:jc w:val="both"/>
         <w:rPr>
           <w:sz w:val="28"/>
@@ -582,16 +992,175 @@
           <w:sz w:val="28"/>
           <w:szCs w:val="28"/>
         </w:rPr>
-        <w:t>‘Add Session Purpose’ – selects one purpose at a time to be added to accumulated purposes.  One can either use the dropdown list or type in a custom purpose followed by ‘Enter.’</w:t>
-      </w:r>
-    </w:p>
-    <w:p>
-      <w:pPr>
-        <w:pStyle w:val="ListParagraph"/>
-        <w:numPr>
-          <w:ilvl w:val="2"/>
-          <w:numId w:val="2"/>
-        </w:numPr>
+        <w:t xml:space="preserve">On the Trailing Training Session tab find three linked entries in the box labeled </w:t>
+      </w:r>
+      <w:r>
+        <w:rPr>
+          <w:b/>
+          <w:bCs/>
+          <w:sz w:val="28"/>
+          <w:szCs w:val="28"/>
+        </w:rPr>
+        <w:t>Distractions</w:t>
+      </w:r>
+      <w:r>
+        <w:rPr>
+          <w:sz w:val="28"/>
+          <w:szCs w:val="28"/>
+        </w:rPr>
+        <w:t>.</w:t>
+      </w:r>
+      <w:r>
+        <w:rPr>
+          <w:sz w:val="28"/>
+          <w:szCs w:val="28"/>
+        </w:rPr>
+        <w:t xml:space="preserve"> First</w:t>
+      </w:r>
+      <w:r>
+        <w:rPr>
+          <w:sz w:val="28"/>
+          <w:szCs w:val="28"/>
+        </w:rPr>
+        <w:t>,</w:t>
+      </w:r>
+      <w:r>
+        <w:rPr>
+          <w:sz w:val="28"/>
+          <w:szCs w:val="28"/>
+        </w:rPr>
+        <w:t xml:space="preserve"> select the desired distraction, then select response. One can either use the dropdown list or type in a custom answer.  If typing a custom response, that entry must be registered by typing </w:t>
+      </w:r>
+      <w:r>
+        <w:rPr>
+          <w:b/>
+          <w:bCs/>
+          <w:sz w:val="28"/>
+          <w:szCs w:val="28"/>
+        </w:rPr>
+        <w:t>Enter</w:t>
+      </w:r>
+      <w:r>
+        <w:rPr>
+          <w:sz w:val="28"/>
+          <w:szCs w:val="28"/>
+        </w:rPr>
+        <w:t xml:space="preserve">.  Notice that the pair will then present in the </w:t>
+      </w:r>
+      <w:r>
+        <w:rPr>
+          <w:b/>
+          <w:bCs/>
+          <w:sz w:val="28"/>
+          <w:szCs w:val="28"/>
+        </w:rPr>
+        <w:t>Accumulated Distractions</w:t>
+      </w:r>
+      <w:r>
+        <w:rPr>
+          <w:sz w:val="28"/>
+          <w:szCs w:val="28"/>
+        </w:rPr>
+        <w:t xml:space="preserve"> table.  If not satisfied with an entry, it can be selected by hovering over the desired entry and clicking the mouse. Note that the </w:t>
+      </w:r>
+      <w:r>
+        <w:rPr>
+          <w:b/>
+          <w:bCs/>
+          <w:sz w:val="28"/>
+          <w:szCs w:val="28"/>
+        </w:rPr>
+        <w:t>Distraction</w:t>
+      </w:r>
+      <w:r>
+        <w:rPr>
+          <w:sz w:val="28"/>
+          <w:szCs w:val="28"/>
+        </w:rPr>
+        <w:t xml:space="preserve"> and </w:t>
+      </w:r>
+      <w:r>
+        <w:rPr>
+          <w:b/>
+          <w:bCs/>
+          <w:sz w:val="28"/>
+          <w:szCs w:val="28"/>
+        </w:rPr>
+        <w:t>Response</w:t>
+      </w:r>
+      <w:r>
+        <w:rPr>
+          <w:sz w:val="28"/>
+          <w:szCs w:val="28"/>
+        </w:rPr>
+        <w:t xml:space="preserve"> fields list that entry and may now be edited. If only the </w:t>
+      </w:r>
+      <w:r>
+        <w:rPr>
+          <w:b/>
+          <w:bCs/>
+          <w:sz w:val="28"/>
+          <w:szCs w:val="28"/>
+        </w:rPr>
+        <w:t>Distraction</w:t>
+      </w:r>
+      <w:r>
+        <w:rPr>
+          <w:sz w:val="28"/>
+          <w:szCs w:val="28"/>
+        </w:rPr>
+        <w:t xml:space="preserve"> entry is modified, click </w:t>
+      </w:r>
+      <w:r>
+        <w:rPr>
+          <w:b/>
+          <w:bCs/>
+          <w:sz w:val="28"/>
+          <w:szCs w:val="28"/>
+        </w:rPr>
+        <w:t>Update</w:t>
+      </w:r>
+      <w:r>
+        <w:rPr>
+          <w:sz w:val="28"/>
+          <w:szCs w:val="28"/>
+        </w:rPr>
+        <w:t xml:space="preserve"> to register that change.</w:t>
+      </w:r>
+      <w:r>
+        <w:rPr>
+          <w:sz w:val="28"/>
+          <w:szCs w:val="28"/>
+        </w:rPr>
+        <w:t xml:space="preserve"> Editing the </w:t>
+      </w:r>
+      <w:r>
+        <w:rPr>
+          <w:b/>
+          <w:bCs/>
+          <w:sz w:val="28"/>
+          <w:szCs w:val="28"/>
+        </w:rPr>
+        <w:t>Response</w:t>
+      </w:r>
+      <w:r>
+        <w:rPr>
+          <w:sz w:val="28"/>
+          <w:szCs w:val="28"/>
+        </w:rPr>
+        <w:t xml:space="preserve"> updates automatically.</w:t>
+      </w:r>
+    </w:p>
+    <w:p>
+      <w:pPr>
+        <w:pStyle w:val="Heading1"/>
+      </w:pPr>
+      <w:r>
+        <w:t>Miscellaneous Items</w:t>
+      </w:r>
+    </w:p>
+    <w:p>
+      <w:pPr>
         <w:jc w:val="both"/>
         <w:rPr>
           <w:sz w:val="28"/>
@@ -600,19 +1169,23 @@
       </w:pPr>
       <w:r>
         <w:rPr>
-          <w:sz w:val="28"/>
-          <w:szCs w:val="28"/>
-        </w:rPr>
-        <w:t>‘Session Purposes’ – is the list of all purposes of this training session.  If a purpose is added by mistake, simply double-click that entry to remove it.</w:t>
-      </w:r>
-    </w:p>
-    <w:p>
-      <w:pPr>
-        <w:pStyle w:val="ListParagraph"/>
-        <w:numPr>
-          <w:ilvl w:val="1"/>
-          <w:numId w:val="2"/>
-        </w:numPr>
+          <w:b/>
+          <w:bCs/>
+          <w:sz w:val="28"/>
+          <w:szCs w:val="28"/>
+        </w:rPr>
+        <w:t>Images</w:t>
+      </w:r>
+      <w:r>
+        <w:rPr>
+          <w:sz w:val="28"/>
+          <w:szCs w:val="28"/>
+        </w:rPr>
+        <w:t xml:space="preserve"> – usually photos or maps can be added either by browsing to the desired file or using Windows drag and drop.</w:t>
+      </w:r>
+    </w:p>
+    <w:p>
+      <w:pPr>
         <w:jc w:val="both"/>
         <w:rPr>
           <w:sz w:val="28"/>
@@ -621,19 +1194,23 @@
       </w:pPr>
       <w:r>
         <w:rPr>
-          <w:sz w:val="28"/>
-          <w:szCs w:val="28"/>
-        </w:rPr>
-        <w:t>‘Add Terrain Type’ and ‘Accumulated Terrains’ behave in the same manner as the Session Purpose pair described above.</w:t>
-      </w:r>
-    </w:p>
-    <w:p>
-      <w:pPr>
-        <w:pStyle w:val="ListParagraph"/>
-        <w:numPr>
-          <w:ilvl w:val="1"/>
-          <w:numId w:val="2"/>
-        </w:numPr>
+          <w:b/>
+          <w:bCs/>
+          <w:sz w:val="28"/>
+          <w:szCs w:val="28"/>
+        </w:rPr>
+        <w:t>View/Edit/Hide Prior Sessions(s)</w:t>
+      </w:r>
+      <w:r>
+        <w:rPr>
+          <w:sz w:val="28"/>
+          <w:szCs w:val="28"/>
+        </w:rPr>
+        <w:t xml:space="preserve"> – This can be useful if the user discovers that a prior session needs to be updated.</w:t>
+      </w:r>
+    </w:p>
+    <w:p>
+      <w:pPr>
         <w:jc w:val="both"/>
         <w:rPr>
           <w:sz w:val="28"/>
@@ -645,134 +1222,107 @@
           <w:sz w:val="28"/>
           <w:szCs w:val="28"/>
         </w:rPr>
+        <w:t xml:space="preserve">The user has the ability to hide a session.  This function is </w:t>
+      </w:r>
+      <w:r>
+        <w:rPr>
+          <w:sz w:val="28"/>
+          <w:szCs w:val="28"/>
+        </w:rPr>
+        <w:t>in lieu</w:t>
+      </w:r>
+      <w:r>
+        <w:rPr>
+          <w:sz w:val="28"/>
+          <w:szCs w:val="28"/>
+        </w:rPr>
+        <w:t xml:space="preserve"> of a delete function which would be permanent and could lead to irreversible errors. When in view mode simply click </w:t>
+      </w:r>
+      <w:r>
+        <w:rPr>
+          <w:b/>
+          <w:bCs/>
+          <w:sz w:val="28"/>
+          <w:szCs w:val="28"/>
+        </w:rPr>
+        <w:t>Hide</w:t>
+      </w:r>
+      <w:r>
+        <w:rPr>
+          <w:sz w:val="28"/>
+          <w:szCs w:val="28"/>
+        </w:rPr>
+        <w:t xml:space="preserve">’ </w:t>
+      </w:r>
+      <w:r>
+        <w:rPr>
+          <w:sz w:val="28"/>
+          <w:szCs w:val="28"/>
+        </w:rPr>
+        <w:t>To return a session to the active list h</w:t>
+      </w:r>
+      <w:r>
+        <w:rPr>
+          <w:sz w:val="28"/>
+          <w:szCs w:val="28"/>
+        </w:rPr>
+        <w:t>idden sessions can be selected from the View/Edit/Hide window using the radio buttons at the bottom of the form.</w:t>
+      </w:r>
+      <w:r>
+        <w:rPr>
+          <w:sz w:val="28"/>
+          <w:szCs w:val="28"/>
+        </w:rPr>
+        <w:t xml:space="preserve"> Then simply click </w:t>
+      </w:r>
+      <w:r>
+        <w:rPr>
+          <w:b/>
+          <w:bCs/>
+          <w:sz w:val="28"/>
+          <w:szCs w:val="28"/>
+        </w:rPr>
+        <w:t>Restore</w:t>
+      </w:r>
+      <w:r>
+        <w:rPr>
+          <w:sz w:val="28"/>
+          <w:szCs w:val="28"/>
+        </w:rPr>
+        <w:t>.</w:t>
+      </w:r>
+    </w:p>
+    <w:p>
+      <w:pPr>
+        <w:jc w:val="both"/>
+        <w:rPr>
+          <w:sz w:val="28"/>
+          <w:szCs w:val="28"/>
+        </w:rPr>
+      </w:pPr>
+      <w:r>
+        <w:rPr>
+          <w:b/>
+          <w:bCs/>
+          <w:sz w:val="28"/>
+          <w:szCs w:val="28"/>
+        </w:rPr>
         <w:lastRenderedPageBreak/>
-        <w:t xml:space="preserve">On the Area Search Training Session Tab </w:t>
-      </w:r>
-      <w:r>
-        <w:rPr>
-          <w:sz w:val="28"/>
-          <w:szCs w:val="28"/>
-        </w:rPr>
-        <w:t xml:space="preserve">‘Number of Subjects’, ‘Subjects Found’ and the table to the right of ‘Subjects Found’ work in tandem.  Notice that ‘Subjects Found’ is disabled until the number of subjects is entered.  Once that is done select the number of subjects found which enables the table to the right.  For each subject found a single click under the heading ‘Indication on Initial Find’ or ‘Indication on Refind’ presents a dropdown box to fill in the </w:t>
-      </w:r>
-      <w:r>
-        <w:rPr>
-          <w:sz w:val="28"/>
-          <w:szCs w:val="28"/>
-        </w:rPr>
-        <w:t>dog’s action.</w:t>
-      </w:r>
-    </w:p>
-    <w:p>
-      <w:pPr>
-        <w:pStyle w:val="ListParagraph"/>
-        <w:numPr>
-          <w:ilvl w:val="1"/>
-          <w:numId w:val="2"/>
-        </w:numPr>
-        <w:jc w:val="both"/>
-        <w:rPr>
-          <w:sz w:val="28"/>
-          <w:szCs w:val="28"/>
-        </w:rPr>
-      </w:pPr>
-      <w:r>
-        <w:rPr>
-          <w:sz w:val="28"/>
-          <w:szCs w:val="28"/>
-        </w:rPr>
-        <w:t>On the Trailing Training Session tab find three linked entries in the box labeled ‘Distractions.’  First select the desired distraction, then select response. One can either use the dropdown list or type in a custom answer.  If typing a custom response, that entry must be registered by typing ‘Enter’.  Notice that the pair will then present in the ‘Accumulated Distractions’ table.  If not satisfied with an entry, it can be selected by hovering over the desired entry and clicking the mouse. Note that the ‘Distraction’ and ‘Response’ fields list that entry and may now be edited. If only the ‘Distraction’ entry is modified, click ‘Update’ to register that change.</w:t>
-      </w:r>
-      <w:r>
-        <w:rPr>
-          <w:sz w:val="28"/>
-          <w:szCs w:val="28"/>
-        </w:rPr>
-        <w:t xml:space="preserve"> Editing the ‘Response’ updates automatically.</w:t>
-      </w:r>
-    </w:p>
-    <w:p>
-      <w:pPr>
-        <w:pStyle w:val="ListParagraph"/>
-        <w:numPr>
-          <w:ilvl w:val="1"/>
-          <w:numId w:val="2"/>
-        </w:numPr>
-        <w:jc w:val="both"/>
-        <w:rPr>
-          <w:sz w:val="28"/>
-          <w:szCs w:val="28"/>
-        </w:rPr>
-      </w:pPr>
-      <w:r>
-        <w:rPr>
-          <w:sz w:val="28"/>
-          <w:szCs w:val="28"/>
-        </w:rPr>
-        <w:t>Images – usually photos or maps can be added either by browsing to the desired file or using Windows drag and drop.</w:t>
-      </w:r>
-    </w:p>
-    <w:p>
-      <w:pPr>
-        <w:pStyle w:val="ListParagraph"/>
-        <w:numPr>
-          <w:ilvl w:val="1"/>
-          <w:numId w:val="2"/>
-        </w:numPr>
-        <w:jc w:val="both"/>
-        <w:rPr>
-          <w:sz w:val="28"/>
-          <w:szCs w:val="28"/>
-        </w:rPr>
-      </w:pPr>
-      <w:r>
-        <w:rPr>
-          <w:sz w:val="28"/>
-          <w:szCs w:val="28"/>
-        </w:rPr>
-        <w:t>‘View/Edit/Hide Prior Sessions(s) – This can be useful if the user discovers that a prior session needs to be updated.</w:t>
-      </w:r>
-    </w:p>
-    <w:p>
-      <w:pPr>
-        <w:pStyle w:val="ListParagraph"/>
-        <w:numPr>
-          <w:ilvl w:val="1"/>
-          <w:numId w:val="2"/>
-        </w:numPr>
-        <w:jc w:val="both"/>
-        <w:rPr>
-          <w:sz w:val="28"/>
-          <w:szCs w:val="28"/>
-        </w:rPr>
-      </w:pPr>
-      <w:r>
-        <w:rPr>
-          <w:sz w:val="28"/>
-          <w:szCs w:val="28"/>
-        </w:rPr>
-        <w:t>The user has the ability to hide a session.  This function is in  lieu of a delete function which would be permanent and could lead to irreversible errors. When in view mode simply click ‘Hide.’ Hidden sessions can be selected from the View/Edit/Hide window using the radio buttons at the bottom of the form.</w:t>
-      </w:r>
-    </w:p>
-    <w:p>
-      <w:pPr>
-        <w:pStyle w:val="ListParagraph"/>
-        <w:numPr>
-          <w:ilvl w:val="1"/>
-          <w:numId w:val="2"/>
-        </w:numPr>
-        <w:jc w:val="both"/>
-        <w:rPr>
-          <w:sz w:val="28"/>
-          <w:szCs w:val="28"/>
-        </w:rPr>
-      </w:pPr>
-      <w:r>
-        <w:rPr>
-          <w:sz w:val="28"/>
-          <w:szCs w:val="28"/>
-        </w:rPr>
-        <w:t>‘Export PDF’ – generates human readable logs for review by team members or for certification.</w:t>
+        <w:t>Export PDF</w:t>
+      </w:r>
+      <w:r>
+        <w:rPr>
+          <w:sz w:val="28"/>
+          <w:szCs w:val="28"/>
+        </w:rPr>
+        <w:t xml:space="preserve"> – generates human readable logs for review by team members or for certification.</w:t>
+      </w:r>
+      <w:r>
+        <w:rPr>
+          <w:sz w:val="28"/>
+          <w:szCs w:val="28"/>
+        </w:rPr>
+        <w:t xml:space="preserve"> These documents are saved in the folder defined at setup time.</w:t>
       </w:r>
     </w:p>
     <w:p>

</xml_diff>

<commit_message>
Many changes: Fixed backup handling -- Now able to restore seemlessly across devices.  UI now displays correct session number when some sessions hidden (deleted).
</commit_message>
<xml_diff>
--- a/SAR K9 Training Record User Manual.docx
+++ b/SAR K9 Training Record User Manual.docx
@@ -76,6 +76,13 @@
       </w:r>
       <w:r>
         <w:rPr>
+          <w:sz w:val="28"/>
+          <w:szCs w:val="28"/>
+        </w:rPr>
+        <w:t>\I{</w:t>
+      </w:r>
+      <w:r>
+        <w:rPr>
           <w:b/>
           <w:bCs/>
           <w:sz w:val="28"/>
@@ -88,7 +95,21 @@
           <w:sz w:val="28"/>
           <w:szCs w:val="28"/>
         </w:rPr>
-        <w:t xml:space="preserve"> button and navigate</w:t>
+        <w:t xml:space="preserve"> button</w:t>
+      </w:r>
+      <w:r>
+        <w:rPr>
+          <w:sz w:val="28"/>
+          <w:szCs w:val="28"/>
+        </w:rPr>
+        <w:t>}</w:t>
+      </w:r>
+      <w:r>
+        <w:rPr>
+          <w:sz w:val="28"/>
+          <w:szCs w:val="28"/>
+        </w:rPr>
+        <w:t xml:space="preserve"> and navigate</w:t>
       </w:r>
       <w:r>
         <w:rPr>
@@ -174,7 +195,35 @@
           <w:sz w:val="28"/>
           <w:szCs w:val="28"/>
         </w:rPr>
-        <w:t>elect a backup folder.  While optional, it is STRONGLY recommended to configure this.  Ideally, this folder should reside on an external hard drive or another service such as Google Drive</w:t>
+        <w:t xml:space="preserve">elect a </w:t>
+      </w:r>
+      <w:r>
+        <w:rPr>
+          <w:sz w:val="28"/>
+          <w:szCs w:val="28"/>
+        </w:rPr>
+        <w:t>\I{</w:t>
+      </w:r>
+      <w:r>
+        <w:rPr>
+          <w:sz w:val="28"/>
+          <w:szCs w:val="28"/>
+        </w:rPr>
+        <w:t>backup folder</w:t>
+      </w:r>
+      <w:r>
+        <w:rPr>
+          <w:sz w:val="28"/>
+          <w:szCs w:val="28"/>
+        </w:rPr>
+        <w:t>}</w:t>
+      </w:r>
+      <w:r>
+        <w:rPr>
+          <w:sz w:val="28"/>
+          <w:szCs w:val="28"/>
+        </w:rPr>
+        <w:t>.  While optional, it is STRONGLY recommended to configure this.  Ideally, this folder should reside on an external hard drive or another service such as Google Drive</w:t>
       </w:r>
       <w:r>
         <w:rPr>
@@ -526,91 +575,7 @@
           <w:sz w:val="28"/>
           <w:szCs w:val="28"/>
         </w:rPr>
-        <w:t xml:space="preserve">Notice that some fields have white backgrounds while others are </w:t>
-      </w:r>
-      <w:r>
-        <w:rPr>
-          <w:sz w:val="28"/>
-          <w:szCs w:val="28"/>
-        </w:rPr>
-        <w:t>light grey</w:t>
-      </w:r>
-      <w:r>
-        <w:rPr>
-          <w:sz w:val="28"/>
-          <w:szCs w:val="28"/>
-        </w:rPr>
-        <w:t xml:space="preserve">. White fields can </w:t>
-      </w:r>
-      <w:r>
-        <w:rPr>
-          <w:sz w:val="28"/>
-          <w:szCs w:val="28"/>
-        </w:rPr>
-        <w:t>generally</w:t>
-      </w:r>
-      <w:r>
-        <w:rPr>
-          <w:sz w:val="28"/>
-          <w:szCs w:val="28"/>
-        </w:rPr>
-        <w:t xml:space="preserve"> have free text entered while light</w:t>
-      </w:r>
-      <w:r>
-        <w:rPr>
-          <w:sz w:val="28"/>
-          <w:szCs w:val="28"/>
-        </w:rPr>
-        <w:t>-</w:t>
-      </w:r>
-      <w:r>
-        <w:rPr>
-          <w:sz w:val="28"/>
-          <w:szCs w:val="28"/>
-        </w:rPr>
-        <w:t>grey windows must use the dropdown by clicking the \N{</w:t>
-      </w:r>
-      <w:r>
-        <w:rPr>
-          <w:sz w:val="28"/>
-          <w:szCs w:val="28"/>
-        </w:rPr>
-        <w:t xml:space="preserve">Modifier Letter </w:t>
-      </w:r>
-      <w:r>
-        <w:rPr>
-          <w:sz w:val="28"/>
-          <w:szCs w:val="28"/>
-        </w:rPr>
-        <w:t xml:space="preserve">Down Arrowhead} </w:t>
-      </w:r>
-      <w:r>
-        <w:rPr>
-          <w:sz w:val="28"/>
-          <w:szCs w:val="28"/>
-        </w:rPr>
-        <w:t xml:space="preserve">or \N{Black Down-Pointing Triangle} </w:t>
-      </w:r>
-      <w:r>
-        <w:rPr>
-          <w:sz w:val="28"/>
-          <w:szCs w:val="28"/>
-        </w:rPr>
-        <w:t xml:space="preserve">on the right side of the entry. A few of the white entry fields also have a \N{Modifier Letter Down Arrowhead} </w:t>
-      </w:r>
-      <w:r>
-        <w:rPr>
-          <w:sz w:val="28"/>
-          <w:szCs w:val="28"/>
-        </w:rPr>
-        <w:t>or \N{Black Down-Pointing Triangle}</w:t>
-      </w:r>
-      <w:r>
-        <w:rPr>
-          <w:sz w:val="28"/>
-          <w:szCs w:val="28"/>
-        </w:rPr>
-        <w:t xml:space="preserve"> for common entries.</w:t>
+        <w:t>After restarting, select either the Area Search or Trailing Training Session tab. Using the mouse drag the window to a desired location on the screen and adjust the window dimensions (via using the mouse to resize it) to your satisfaction.  That placement and window size will be saved and used the next time the program is started.</w:t>
       </w:r>
     </w:p>
     <w:p>
@@ -628,61 +593,101 @@
       </w:pPr>
       <w:r>
         <w:rPr>
-          <w:b/>
-          <w:bCs/>
-          <w:sz w:val="28"/>
-          <w:szCs w:val="28"/>
-        </w:rPr>
-        <w:t>Start Time and Finish Time entries</w:t>
-      </w:r>
-      <w:r>
-        <w:rPr>
-          <w:sz w:val="28"/>
-          <w:szCs w:val="28"/>
-        </w:rPr>
-        <w:t xml:space="preserve"> </w:t>
-      </w:r>
-      <w:r>
-        <w:rPr>
-          <w:sz w:val="28"/>
-          <w:szCs w:val="28"/>
-        </w:rPr>
-        <w:t>–</w:t>
-      </w:r>
-      <w:r>
-        <w:rPr>
-          <w:sz w:val="28"/>
-          <w:szCs w:val="28"/>
-        </w:rPr>
-        <w:t xml:space="preserve"> </w:t>
-      </w:r>
-      <w:r>
-        <w:rPr>
-          <w:sz w:val="28"/>
-          <w:szCs w:val="28"/>
-        </w:rPr>
-        <w:t xml:space="preserve">hover the mouse over the left half and rotate the mouse scroll wheel to change the hour.  Hover over the right side to adjust the minutes.  The time is recorded in </w:t>
-      </w:r>
-      <w:r>
-        <w:rPr>
-          <w:sz w:val="28"/>
-          <w:szCs w:val="28"/>
-        </w:rPr>
-        <w:t>24-hour</w:t>
-      </w:r>
-      <w:r>
-        <w:rPr>
-          <w:sz w:val="28"/>
-          <w:szCs w:val="28"/>
-        </w:rPr>
-        <w:t xml:space="preserve"> Military time to avoid confusion.</w:t>
-      </w:r>
-      <w:r>
-        <w:rPr>
-          <w:sz w:val="28"/>
-          <w:szCs w:val="28"/>
-        </w:rPr>
-        <w:t xml:space="preserve"> Light grey in the time entry implies that no time is selected.  If a time is accidentally entered, double-click over the colon ‘:’ in that entry to unset it.</w:t>
+          <w:sz w:val="28"/>
+          <w:szCs w:val="28"/>
+        </w:rPr>
+        <w:t xml:space="preserve">Notice that some fields have white backgrounds while others are </w:t>
+      </w:r>
+      <w:r>
+        <w:rPr>
+          <w:sz w:val="28"/>
+          <w:szCs w:val="28"/>
+        </w:rPr>
+        <w:t>light grey</w:t>
+      </w:r>
+      <w:r>
+        <w:rPr>
+          <w:sz w:val="28"/>
+          <w:szCs w:val="28"/>
+        </w:rPr>
+        <w:t xml:space="preserve">. White fields can </w:t>
+      </w:r>
+      <w:r>
+        <w:rPr>
+          <w:sz w:val="28"/>
+          <w:szCs w:val="28"/>
+        </w:rPr>
+        <w:t>generally</w:t>
+      </w:r>
+      <w:r>
+        <w:rPr>
+          <w:sz w:val="28"/>
+          <w:szCs w:val="28"/>
+        </w:rPr>
+        <w:t xml:space="preserve"> have free text entered while light</w:t>
+      </w:r>
+      <w:r>
+        <w:rPr>
+          <w:sz w:val="28"/>
+          <w:szCs w:val="28"/>
+        </w:rPr>
+        <w:t>-</w:t>
+      </w:r>
+      <w:r>
+        <w:rPr>
+          <w:sz w:val="28"/>
+          <w:szCs w:val="28"/>
+        </w:rPr>
+        <w:t>grey windows must use the dropdown by clicking the \N{</w:t>
+      </w:r>
+      <w:r>
+        <w:rPr>
+          <w:sz w:val="28"/>
+          <w:szCs w:val="28"/>
+        </w:rPr>
+        <w:t xml:space="preserve">Modifier Letter </w:t>
+      </w:r>
+      <w:r>
+        <w:rPr>
+          <w:sz w:val="28"/>
+          <w:szCs w:val="28"/>
+        </w:rPr>
+        <w:t xml:space="preserve">Down Arrowhead} </w:t>
+      </w:r>
+      <w:r>
+        <w:rPr>
+          <w:sz w:val="28"/>
+          <w:szCs w:val="28"/>
+        </w:rPr>
+        <w:t xml:space="preserve">or \N{Black Down-Pointing Triangle} </w:t>
+      </w:r>
+      <w:r>
+        <w:rPr>
+          <w:sz w:val="28"/>
+          <w:szCs w:val="28"/>
+        </w:rPr>
+        <w:t xml:space="preserve">on the right side of the entry. A few of the white entry fields also have a \N{Modifier Letter Down Arrowhead} </w:t>
+      </w:r>
+      <w:r>
+        <w:rPr>
+          <w:sz w:val="28"/>
+          <w:szCs w:val="28"/>
+        </w:rPr>
+        <w:t>or \N{Black Down-Pointing Triangle}</w:t>
+      </w:r>
+      <w:r>
+        <w:rPr>
+          <w:sz w:val="28"/>
+          <w:szCs w:val="28"/>
+        </w:rPr>
+        <w:t xml:space="preserve"> for common entries.</w:t>
+      </w:r>
+      <w:r>
+        <w:rPr>
+          <w:sz w:val="28"/>
+          <w:szCs w:val="28"/>
+        </w:rPr>
+        <w:t xml:space="preserve"> These entries can accept either text or selection via the dropdown menu.</w:t>
       </w:r>
     </w:p>
     <w:p>
@@ -705,6 +710,78 @@
           <w:sz w:val="28"/>
           <w:szCs w:val="28"/>
         </w:rPr>
+        <w:t>Start Time and Finish Time entries</w:t>
+      </w:r>
+      <w:r>
+        <w:rPr>
+          <w:sz w:val="28"/>
+          <w:szCs w:val="28"/>
+        </w:rPr>
+        <w:t xml:space="preserve"> </w:t>
+      </w:r>
+      <w:r>
+        <w:rPr>
+          <w:sz w:val="28"/>
+          <w:szCs w:val="28"/>
+        </w:rPr>
+        <w:t>–</w:t>
+      </w:r>
+      <w:r>
+        <w:rPr>
+          <w:sz w:val="28"/>
+          <w:szCs w:val="28"/>
+        </w:rPr>
+        <w:t xml:space="preserve"> </w:t>
+      </w:r>
+      <w:r>
+        <w:rPr>
+          <w:sz w:val="28"/>
+          <w:szCs w:val="28"/>
+        </w:rPr>
+        <w:t xml:space="preserve">hover the mouse over the left half and rotate the mouse scroll wheel to change the hour.  Hover over the right side to adjust the minutes.  The time is recorded in </w:t>
+      </w:r>
+      <w:r>
+        <w:rPr>
+          <w:sz w:val="28"/>
+          <w:szCs w:val="28"/>
+        </w:rPr>
+        <w:t>24-hour</w:t>
+      </w:r>
+      <w:r>
+        <w:rPr>
+          <w:sz w:val="28"/>
+          <w:szCs w:val="28"/>
+        </w:rPr>
+        <w:t xml:space="preserve"> Military time to avoid confusion.</w:t>
+      </w:r>
+      <w:r>
+        <w:rPr>
+          <w:sz w:val="28"/>
+          <w:szCs w:val="28"/>
+        </w:rPr>
+        <w:t xml:space="preserve"> Light grey in the time entry implies that no time is selected.  If a time is accidentally entered, double-click over the colon ‘:’ in that entry to unset it.</w:t>
+      </w:r>
+    </w:p>
+    <w:p>
+      <w:pPr>
+        <w:pStyle w:val="ListParagraph"/>
+        <w:numPr>
+          <w:ilvl w:val="0"/>
+          <w:numId w:val="2"/>
+        </w:numPr>
+        <w:jc w:val="both"/>
+        <w:rPr>
+          <w:sz w:val="28"/>
+          <w:szCs w:val="28"/>
+        </w:rPr>
+      </w:pPr>
+      <w:r>
+        <w:rPr>
+          <w:b/>
+          <w:bCs/>
+          <w:sz w:val="28"/>
+          <w:szCs w:val="28"/>
+        </w:rPr>
         <w:t xml:space="preserve">Add Session Purpose </w:t>
       </w:r>
       <w:r>
@@ -827,6 +904,7 @@
           <w:sz w:val="28"/>
           <w:szCs w:val="28"/>
         </w:rPr>
+        <w:lastRenderedPageBreak/>
         <w:t>Session Purposes</w:t>
       </w:r>
       <w:r>
@@ -888,7 +966,6 @@
         <w:pStyle w:val="Heading1"/>
       </w:pPr>
       <w:r>
-        <w:lastRenderedPageBreak/>
         <w:t xml:space="preserve">Area Search Session Specific </w:t>
       </w:r>
       <w:r>
@@ -1181,7 +1258,21 @@
           <w:sz w:val="28"/>
           <w:szCs w:val="28"/>
         </w:rPr>
-        <w:t xml:space="preserve"> – usually photos or maps can be added either by browsing to the desired file or using Windows drag and drop.</w:t>
+        <w:t xml:space="preserve"> – photos or maps </w:t>
+      </w:r>
+      <w:r>
+        <w:rPr>
+          <w:sz w:val="28"/>
+          <w:szCs w:val="28"/>
+        </w:rPr>
+        <w:t xml:space="preserve">or GoPro mp4 files </w:t>
+      </w:r>
+      <w:r>
+        <w:rPr>
+          <w:sz w:val="28"/>
+          <w:szCs w:val="28"/>
+        </w:rPr>
+        <w:t>can be added either by browsing to the desired file or using Windows drag and drop.</w:t>
       </w:r>
     </w:p>
     <w:p>
@@ -1208,6 +1299,53 @@
         </w:rPr>
         <w:t xml:space="preserve"> – This can be useful if the user discovers that a prior session needs to be updated.</w:t>
       </w:r>
+      <w:r>
+        <w:rPr>
+          <w:sz w:val="28"/>
+          <w:szCs w:val="28"/>
+        </w:rPr>
+        <w:t xml:space="preserve"> Simply select a session or group of sessions to review.  If a session is to be updated, make the desired changes followed by clicking </w:t>
+      </w:r>
+      <w:r>
+        <w:rPr>
+          <w:sz w:val="28"/>
+          <w:szCs w:val="28"/>
+        </w:rPr>
+        <w:lastRenderedPageBreak/>
+        <w:t xml:space="preserve">the </w:t>
+      </w:r>
+      <w:r>
+        <w:rPr>
+          <w:b/>
+          <w:bCs/>
+          <w:sz w:val="28"/>
+          <w:szCs w:val="28"/>
+        </w:rPr>
+        <w:t>Update Session</w:t>
+      </w:r>
+      <w:r>
+        <w:rPr>
+          <w:sz w:val="28"/>
+          <w:szCs w:val="28"/>
+        </w:rPr>
+        <w:t xml:space="preserve"> button.  If more than one session is to be updated, click </w:t>
+      </w:r>
+      <w:r>
+        <w:rPr>
+          <w:b/>
+          <w:bCs/>
+          <w:sz w:val="28"/>
+          <w:szCs w:val="28"/>
+        </w:rPr>
+        <w:t>View/Edit/Hide Prior Session(s)</w:t>
+      </w:r>
+      <w:r>
+        <w:rPr>
+          <w:sz w:val="28"/>
+          <w:szCs w:val="28"/>
+        </w:rPr>
+        <w:t xml:space="preserve"> again and select the session to update.</w:t>
+      </w:r>
     </w:p>
     <w:p>
       <w:pPr>
@@ -1222,7 +1360,21 @@
           <w:sz w:val="28"/>
           <w:szCs w:val="28"/>
         </w:rPr>
-        <w:t xml:space="preserve">The user has the ability to hide a session.  This function is </w:t>
+        <w:t xml:space="preserve">The user </w:t>
+      </w:r>
+      <w:r>
+        <w:rPr>
+          <w:sz w:val="28"/>
+          <w:szCs w:val="28"/>
+        </w:rPr>
+        <w:t xml:space="preserve">also </w:t>
+      </w:r>
+      <w:r>
+        <w:rPr>
+          <w:sz w:val="28"/>
+          <w:szCs w:val="28"/>
+        </w:rPr>
+        <w:t xml:space="preserve">has the ability to hide a session.  This function is </w:t>
       </w:r>
       <w:r>
         <w:rPr>
@@ -1236,7 +1388,21 @@
           <w:sz w:val="28"/>
           <w:szCs w:val="28"/>
         </w:rPr>
-        <w:t xml:space="preserve"> of a delete function which would be permanent and could lead to irreversible errors. When in view mode simply click </w:t>
+        <w:t xml:space="preserve"> of a delete function which would be permanent and could lead to irreversible </w:t>
+      </w:r>
+      <w:r>
+        <w:rPr>
+          <w:sz w:val="28"/>
+          <w:szCs w:val="28"/>
+        </w:rPr>
+        <w:t>data loss</w:t>
+      </w:r>
+      <w:r>
+        <w:rPr>
+          <w:sz w:val="28"/>
+          <w:szCs w:val="28"/>
+        </w:rPr>
+        <w:t xml:space="preserve">. When in view mode simply click </w:t>
       </w:r>
       <w:r>
         <w:rPr>
@@ -1252,7 +1418,14 @@
           <w:sz w:val="28"/>
           <w:szCs w:val="28"/>
         </w:rPr>
-        <w:t xml:space="preserve">’ </w:t>
+        <w:t>.</w:t>
+      </w:r>
+      <w:r>
+        <w:rPr>
+          <w:sz w:val="28"/>
+          <w:szCs w:val="28"/>
+        </w:rPr>
+        <w:t xml:space="preserve"> </w:t>
       </w:r>
       <w:r>
         <w:rPr>
@@ -1307,7 +1480,6 @@
           <w:sz w:val="28"/>
           <w:szCs w:val="28"/>
         </w:rPr>
-        <w:lastRenderedPageBreak/>
         <w:t>Export PDF</w:t>
       </w:r>
       <w:r>

</xml_diff>

<commit_message>
Added simulated lock file to remote backup folder to help multiple people access the same data set.  Locked some cells in Excel files that users should never edit.
</commit_message>
<xml_diff>
--- a/SAR K9 Training Record User Manual.docx
+++ b/SAR K9 Training Record User Manual.docx
@@ -37,6 +37,29 @@
           <w:szCs w:val="28"/>
         </w:rPr>
         <w:t xml:space="preserve">  It is advised that the user read this entire document one time to get an idea of how to use the program.  However, it is not necessary to memorize it since tooltips pop up when hovering the mouse over most of the more complicated entries.</w:t>
+      </w:r>
+    </w:p>
+    <w:p>
+      <w:pPr>
+        <w:pStyle w:val="Heading1"/>
+      </w:pPr>
+      <w:r>
+        <w:t>Backup</w:t>
+      </w:r>
+    </w:p>
+    <w:p>
+      <w:pPr>
+        <w:rPr>
+          <w:sz w:val="28"/>
+          <w:szCs w:val="28"/>
+        </w:rPr>
+      </w:pPr>
+      <w:r>
+        <w:rPr>
+          <w:sz w:val="28"/>
+          <w:szCs w:val="28"/>
+        </w:rPr>
+        <w:t>Automatic Backup is managed with two methods.  A full backup is created each time the program is edited which is saved to the Primary Storage Folder.  If a Secondary Storage Folder is selected that backup is also saved here.  If this folder is shared with another user (such as a shared Google Drive) it is automatically used to ensure the most current session log. (More about this later.)</w:t>
       </w:r>
     </w:p>
     <w:p>
@@ -286,6 +309,7 @@
           <w:sz w:val="28"/>
           <w:szCs w:val="28"/>
         </w:rPr>
+        <w:lastRenderedPageBreak/>
         <w:t>Configure a folder for Excel compatible data files.</w:t>
       </w:r>
       <w:r>
@@ -418,7 +442,6 @@
           <w:sz w:val="28"/>
           <w:szCs w:val="28"/>
         </w:rPr>
-        <w:lastRenderedPageBreak/>
         <w:t>Terrain Types</w:t>
       </w:r>
       <w:r>
@@ -738,7 +761,15 @@
           <w:sz w:val="28"/>
           <w:szCs w:val="28"/>
         </w:rPr>
-        <w:t xml:space="preserve">hover the mouse over the left half and rotate the mouse scroll wheel to change the hour.  Hover over the right side to adjust the minutes.  The time is recorded in </w:t>
+        <w:t xml:space="preserve">hover the mouse over the left half and rotate the mouse scroll wheel to change the hour.  Hover over the right side </w:t>
+      </w:r>
+      <w:r>
+        <w:rPr>
+          <w:sz w:val="28"/>
+          <w:szCs w:val="28"/>
+        </w:rPr>
+        <w:lastRenderedPageBreak/>
+        <w:t xml:space="preserve">to adjust the minutes.  The time is recorded in </w:t>
       </w:r>
       <w:r>
         <w:rPr>
@@ -904,7 +935,6 @@
           <w:sz w:val="28"/>
           <w:szCs w:val="28"/>
         </w:rPr>
-        <w:lastRenderedPageBreak/>
         <w:t>Session Purposes</w:t>
       </w:r>
       <w:r>
@@ -1170,7 +1200,15 @@
           <w:sz w:val="28"/>
           <w:szCs w:val="28"/>
         </w:rPr>
-        <w:t xml:space="preserve"> fields list that entry and may now be edited. If only the </w:t>
+        <w:t xml:space="preserve"> fields list that entry and may now be edited. If </w:t>
+      </w:r>
+      <w:r>
+        <w:rPr>
+          <w:sz w:val="28"/>
+          <w:szCs w:val="28"/>
+        </w:rPr>
+        <w:lastRenderedPageBreak/>
+        <w:t xml:space="preserve">only the </w:t>
       </w:r>
       <w:r>
         <w:rPr>
@@ -1304,15 +1342,7 @@
           <w:sz w:val="28"/>
           <w:szCs w:val="28"/>
         </w:rPr>
-        <w:t xml:space="preserve"> Simply select a session or group of sessions to review.  If a session is to be updated, make the desired changes followed by clicking </w:t>
-      </w:r>
-      <w:r>
-        <w:rPr>
-          <w:sz w:val="28"/>
-          <w:szCs w:val="28"/>
-        </w:rPr>
-        <w:lastRenderedPageBreak/>
-        <w:t xml:space="preserve">the </w:t>
+        <w:t xml:space="preserve"> Simply select a session or group of sessions to review.  If a session is to be updated, make the desired changes followed by clicking the </w:t>
       </w:r>
       <w:r>
         <w:rPr>
@@ -1495,6 +1525,96 @@
           <w:szCs w:val="28"/>
         </w:rPr>
         <w:t xml:space="preserve"> These documents are saved in the folder defined at setup time.</w:t>
+      </w:r>
+    </w:p>
+    <w:p>
+      <w:pPr>
+        <w:pStyle w:val="Heading1"/>
+      </w:pPr>
+      <w:r>
+        <w:t>Backup Details</w:t>
+      </w:r>
+    </w:p>
+    <w:p>
+      <w:pPr>
+        <w:rPr>
+          <w:sz w:val="28"/>
+          <w:szCs w:val="28"/>
+        </w:rPr>
+      </w:pPr>
+      <w:r>
+        <w:rPr>
+          <w:sz w:val="28"/>
+          <w:szCs w:val="28"/>
+        </w:rPr>
+        <w:t>As mentioned before, there are multiple methods of automatic backup. Those methods are:</w:t>
+      </w:r>
+    </w:p>
+    <w:p>
+      <w:pPr>
+        <w:pStyle w:val="ListParagraph"/>
+        <w:numPr>
+          <w:ilvl w:val="0"/>
+          <w:numId w:val="3"/>
+        </w:numPr>
+        <w:rPr>
+          <w:sz w:val="28"/>
+          <w:szCs w:val="28"/>
+        </w:rPr>
+      </w:pPr>
+      <w:r>
+        <w:rPr>
+          <w:sz w:val="28"/>
+          <w:szCs w:val="28"/>
+        </w:rPr>
+        <w:t>Full backup to the Primary Storage Folder</w:t>
+      </w:r>
+    </w:p>
+    <w:p>
+      <w:pPr>
+        <w:pStyle w:val="ListParagraph"/>
+        <w:numPr>
+          <w:ilvl w:val="0"/>
+          <w:numId w:val="3"/>
+        </w:numPr>
+        <w:rPr>
+          <w:sz w:val="28"/>
+          <w:szCs w:val="28"/>
+        </w:rPr>
+      </w:pPr>
+      <w:r>
+        <w:rPr>
+          <w:sz w:val="28"/>
+          <w:szCs w:val="28"/>
+        </w:rPr>
+        <w:t>Full backup to the Secondary Storage Folder</w:t>
+      </w:r>
+    </w:p>
+    <w:p>
+      <w:pPr>
+        <w:pStyle w:val="ListParagraph"/>
+        <w:numPr>
+          <w:ilvl w:val="0"/>
+          <w:numId w:val="3"/>
+        </w:numPr>
+        <w:rPr>
+          <w:sz w:val="28"/>
+          <w:szCs w:val="28"/>
+        </w:rPr>
+      </w:pPr>
+      <w:r>
+        <w:rPr>
+          <w:sz w:val="28"/>
+          <w:szCs w:val="28"/>
+        </w:rPr>
+        <w:t>Area Search and Trailing backup to Excel compatible files if the Excel File Folder is configured.  These files can be edited but extreme care must be taken to avoid corrupting data.</w:t>
+      </w:r>
+      <w:r>
+        <w:rPr>
+          <w:sz w:val="28"/>
+          <w:szCs w:val="28"/>
+        </w:rPr>
+        <w:t xml:space="preserve"> Also, note that it may generate a ‘Conflict’ between remote data and local data.  Select Remote to incorporate your changes.</w:t>
       </w:r>
     </w:p>
     <w:p>
@@ -1608,6 +1728,95 @@
     </w:lvl>
   </w:abstractNum>
   <w:abstractNum w:abstractNumId="1" w15:restartNumberingAfterBreak="0">
+    <w:nsid w:val="61C05AFD"/>
+    <w:multiLevelType w:val="hybridMultilevel"/>
+    <w:tmpl w:val="E216EDB2"/>
+    <w:lvl w:ilvl="0" w:tplc="04090011">
+      <w:start w:val="1"/>
+      <w:numFmt w:val="decimal"/>
+      <w:lvlText w:val="%1)"/>
+      <w:lvlJc w:val="left"/>
+      <w:pPr>
+        <w:ind w:left="720" w:hanging="360"/>
+      </w:pPr>
+      <w:rPr>
+        <w:rFonts w:hint="default"/>
+      </w:rPr>
+    </w:lvl>
+    <w:lvl w:ilvl="1" w:tplc="04090019" w:tentative="1">
+      <w:start w:val="1"/>
+      <w:numFmt w:val="lowerLetter"/>
+      <w:lvlText w:val="%2."/>
+      <w:lvlJc w:val="left"/>
+      <w:pPr>
+        <w:ind w:left="1440" w:hanging="360"/>
+      </w:pPr>
+    </w:lvl>
+    <w:lvl w:ilvl="2" w:tplc="0409001B" w:tentative="1">
+      <w:start w:val="1"/>
+      <w:numFmt w:val="lowerRoman"/>
+      <w:lvlText w:val="%3."/>
+      <w:lvlJc w:val="right"/>
+      <w:pPr>
+        <w:ind w:left="2160" w:hanging="180"/>
+      </w:pPr>
+    </w:lvl>
+    <w:lvl w:ilvl="3" w:tplc="0409000F" w:tentative="1">
+      <w:start w:val="1"/>
+      <w:numFmt w:val="decimal"/>
+      <w:lvlText w:val="%4."/>
+      <w:lvlJc w:val="left"/>
+      <w:pPr>
+        <w:ind w:left="2880" w:hanging="360"/>
+      </w:pPr>
+    </w:lvl>
+    <w:lvl w:ilvl="4" w:tplc="04090019" w:tentative="1">
+      <w:start w:val="1"/>
+      <w:numFmt w:val="lowerLetter"/>
+      <w:lvlText w:val="%5."/>
+      <w:lvlJc w:val="left"/>
+      <w:pPr>
+        <w:ind w:left="3600" w:hanging="360"/>
+      </w:pPr>
+    </w:lvl>
+    <w:lvl w:ilvl="5" w:tplc="0409001B" w:tentative="1">
+      <w:start w:val="1"/>
+      <w:numFmt w:val="lowerRoman"/>
+      <w:lvlText w:val="%6."/>
+      <w:lvlJc w:val="right"/>
+      <w:pPr>
+        <w:ind w:left="4320" w:hanging="180"/>
+      </w:pPr>
+    </w:lvl>
+    <w:lvl w:ilvl="6" w:tplc="0409000F" w:tentative="1">
+      <w:start w:val="1"/>
+      <w:numFmt w:val="decimal"/>
+      <w:lvlText w:val="%7."/>
+      <w:lvlJc w:val="left"/>
+      <w:pPr>
+        <w:ind w:left="5040" w:hanging="360"/>
+      </w:pPr>
+    </w:lvl>
+    <w:lvl w:ilvl="7" w:tplc="04090019" w:tentative="1">
+      <w:start w:val="1"/>
+      <w:numFmt w:val="lowerLetter"/>
+      <w:lvlText w:val="%8."/>
+      <w:lvlJc w:val="left"/>
+      <w:pPr>
+        <w:ind w:left="5760" w:hanging="360"/>
+      </w:pPr>
+    </w:lvl>
+    <w:lvl w:ilvl="8" w:tplc="0409001B" w:tentative="1">
+      <w:start w:val="1"/>
+      <w:numFmt w:val="lowerRoman"/>
+      <w:lvlText w:val="%9."/>
+      <w:lvlJc w:val="right"/>
+      <w:pPr>
+        <w:ind w:left="6480" w:hanging="180"/>
+      </w:pPr>
+    </w:lvl>
+  </w:abstractNum>
+  <w:abstractNum w:abstractNumId="2" w15:restartNumberingAfterBreak="0">
     <w:nsid w:val="7A2956EE"/>
     <w:multiLevelType w:val="hybridMultilevel"/>
     <w:tmpl w:val="BBE8451C"/>
@@ -1700,6 +1909,9 @@
     <w:abstractNumId w:val="0"/>
   </w:num>
   <w:num w:numId="2" w16cid:durableId="1733845587">
+    <w:abstractNumId w:val="2"/>
+  </w:num>
+  <w:num w:numId="3" w16cid:durableId="790323579">
     <w:abstractNumId w:val="1"/>
   </w:num>
 </w:numbering>

</xml_diff>

<commit_message>
Updated Help.  Cleaned up some unicode issues
</commit_message>
<xml_diff>
--- a/SAR K9 Training Record User Manual.docx
+++ b/SAR K9 Training Record User Manual.docx
@@ -102,8 +102,17 @@
           <w:sz w:val="28"/>
           <w:szCs w:val="28"/>
         </w:rPr>
-        <w:t>\I{</w:t>
-      </w:r>
+        <w:t>\</w:t>
+      </w:r>
+      <w:proofErr w:type="gramStart"/>
+      <w:r>
+        <w:rPr>
+          <w:sz w:val="28"/>
+          <w:szCs w:val="28"/>
+        </w:rPr>
+        <w:t>I{</w:t>
+      </w:r>
+      <w:proofErr w:type="gramEnd"/>
       <w:r>
         <w:rPr>
           <w:b/>
@@ -225,8 +234,17 @@
           <w:sz w:val="28"/>
           <w:szCs w:val="28"/>
         </w:rPr>
-        <w:t>\I{</w:t>
-      </w:r>
+        <w:t>\</w:t>
+      </w:r>
+      <w:proofErr w:type="gramStart"/>
+      <w:r>
+        <w:rPr>
+          <w:sz w:val="28"/>
+          <w:szCs w:val="28"/>
+        </w:rPr>
+        <w:t>I{</w:t>
+      </w:r>
+      <w:proofErr w:type="gramEnd"/>
       <w:r>
         <w:rPr>
           <w:sz w:val="28"/>
@@ -490,14 +508,30 @@
           <w:sz w:val="28"/>
           <w:szCs w:val="28"/>
         </w:rPr>
-        <w:t>The m</w:t>
-      </w:r>
-      <w:r>
-        <w:rPr>
-          <w:sz w:val="28"/>
-          <w:szCs w:val="28"/>
-        </w:rPr>
-        <w:t>ost commonly used entries should usually appear at the top of each list.</w:t>
+        <w:t xml:space="preserve">The </w:t>
+      </w:r>
+      <w:proofErr w:type="gramStart"/>
+      <w:r>
+        <w:rPr>
+          <w:sz w:val="28"/>
+          <w:szCs w:val="28"/>
+        </w:rPr>
+        <w:t>m</w:t>
+      </w:r>
+      <w:r>
+        <w:rPr>
+          <w:sz w:val="28"/>
+          <w:szCs w:val="28"/>
+        </w:rPr>
+        <w:t>ost commonly used</w:t>
+      </w:r>
+      <w:proofErr w:type="gramEnd"/>
+      <w:r>
+        <w:rPr>
+          <w:sz w:val="28"/>
+          <w:szCs w:val="28"/>
+        </w:rPr>
+        <w:t xml:space="preserve"> entries should usually appear at the top of each list.</w:t>
       </w:r>
     </w:p>
     <w:p>
@@ -541,8 +575,17 @@
           <w:sz w:val="28"/>
           <w:szCs w:val="28"/>
         </w:rPr>
-        <w:t xml:space="preserve"> \N{</w:t>
-      </w:r>
+        <w:t xml:space="preserve"> \</w:t>
+      </w:r>
+      <w:proofErr w:type="gramStart"/>
+      <w:r>
+        <w:rPr>
+          <w:sz w:val="28"/>
+          <w:szCs w:val="28"/>
+        </w:rPr>
+        <w:t>N{</w:t>
+      </w:r>
+      <w:proofErr w:type="gramEnd"/>
       <w:r>
         <w:rPr>
           <w:sz w:val="28"/>
@@ -661,8 +704,17 @@
           <w:sz w:val="28"/>
           <w:szCs w:val="28"/>
         </w:rPr>
-        <w:t>grey windows must use the dropdown by clicking the \N{</w:t>
-      </w:r>
+        <w:t>grey windows must use the dropdown by clicking the \</w:t>
+      </w:r>
+      <w:proofErr w:type="gramStart"/>
+      <w:r>
+        <w:rPr>
+          <w:sz w:val="28"/>
+          <w:szCs w:val="28"/>
+        </w:rPr>
+        <w:t>N{</w:t>
+      </w:r>
+      <w:proofErr w:type="gramEnd"/>
       <w:r>
         <w:rPr>
           <w:sz w:val="28"/>
@@ -682,21 +734,69 @@
           <w:sz w:val="28"/>
           <w:szCs w:val="28"/>
         </w:rPr>
-        <w:t xml:space="preserve">or \N{Black Down-Pointing Triangle} </w:t>
-      </w:r>
-      <w:r>
-        <w:rPr>
-          <w:sz w:val="28"/>
-          <w:szCs w:val="28"/>
-        </w:rPr>
-        <w:t xml:space="preserve">on the right side of the entry. A few of the white entry fields also have a \N{Modifier Letter Down Arrowhead} </w:t>
-      </w:r>
-      <w:r>
-        <w:rPr>
-          <w:sz w:val="28"/>
-          <w:szCs w:val="28"/>
-        </w:rPr>
-        <w:t>or \N{Black Down-Pointing Triangle}</w:t>
+        <w:t>or \</w:t>
+      </w:r>
+      <w:proofErr w:type="gramStart"/>
+      <w:r>
+        <w:rPr>
+          <w:sz w:val="28"/>
+          <w:szCs w:val="28"/>
+        </w:rPr>
+        <w:t>N{</w:t>
+      </w:r>
+      <w:proofErr w:type="gramEnd"/>
+      <w:r>
+        <w:rPr>
+          <w:sz w:val="28"/>
+          <w:szCs w:val="28"/>
+        </w:rPr>
+        <w:t xml:space="preserve">Black Down-Pointing Triangle} </w:t>
+      </w:r>
+      <w:r>
+        <w:rPr>
+          <w:sz w:val="28"/>
+          <w:szCs w:val="28"/>
+        </w:rPr>
+        <w:t>on the right side of the entry. A few of the white entry fields also have a \</w:t>
+      </w:r>
+      <w:proofErr w:type="gramStart"/>
+      <w:r>
+        <w:rPr>
+          <w:sz w:val="28"/>
+          <w:szCs w:val="28"/>
+        </w:rPr>
+        <w:t>N{</w:t>
+      </w:r>
+      <w:proofErr w:type="gramEnd"/>
+      <w:r>
+        <w:rPr>
+          <w:sz w:val="28"/>
+          <w:szCs w:val="28"/>
+        </w:rPr>
+        <w:t xml:space="preserve">Modifier Letter Down Arrowhead} </w:t>
+      </w:r>
+      <w:r>
+        <w:rPr>
+          <w:sz w:val="28"/>
+          <w:szCs w:val="28"/>
+        </w:rPr>
+        <w:t>or \</w:t>
+      </w:r>
+      <w:proofErr w:type="gramStart"/>
+      <w:r>
+        <w:rPr>
+          <w:sz w:val="28"/>
+          <w:szCs w:val="28"/>
+        </w:rPr>
+        <w:t>N{</w:t>
+      </w:r>
+      <w:proofErr w:type="gramEnd"/>
+      <w:r>
+        <w:rPr>
+          <w:sz w:val="28"/>
+          <w:szCs w:val="28"/>
+        </w:rPr>
+        <w:t>Black Down-Pointing Triangle}</w:t>
       </w:r>
       <w:r>
         <w:rPr>
@@ -790,7 +890,23 @@
           <w:sz w:val="28"/>
           <w:szCs w:val="28"/>
         </w:rPr>
-        <w:t xml:space="preserve"> Light grey in the time entry implies that no time is selected.  If a time is accidentally entered, double-click over the colon ‘:’ in that entry to unset it.</w:t>
+        <w:t xml:space="preserve"> Light grey in the time entry implies that no time is selected.  If </w:t>
+      </w:r>
+      <w:proofErr w:type="gramStart"/>
+      <w:r>
+        <w:rPr>
+          <w:sz w:val="28"/>
+          <w:szCs w:val="28"/>
+        </w:rPr>
+        <w:t>a time</w:t>
+      </w:r>
+      <w:proofErr w:type="gramEnd"/>
+      <w:r>
+        <w:rPr>
+          <w:sz w:val="28"/>
+          <w:szCs w:val="28"/>
+        </w:rPr>
+        <w:t xml:space="preserve"> is accidentally entered, double-click over the colon ‘:’ in that entry to unset it.</w:t>
       </w:r>
     </w:p>
     <w:p>
@@ -896,7 +1012,23 @@
           <w:sz w:val="28"/>
           <w:szCs w:val="28"/>
         </w:rPr>
-        <w:t xml:space="preserve"> either use the dropdown list or type in a custom purpose followed by </w:t>
+        <w:t xml:space="preserve"> </w:t>
+      </w:r>
+      <w:proofErr w:type="gramStart"/>
+      <w:r>
+        <w:rPr>
+          <w:sz w:val="28"/>
+          <w:szCs w:val="28"/>
+        </w:rPr>
+        <w:t>either use</w:t>
+      </w:r>
+      <w:proofErr w:type="gramEnd"/>
+      <w:r>
+        <w:rPr>
+          <w:sz w:val="28"/>
+          <w:szCs w:val="28"/>
+        </w:rPr>
+        <w:t xml:space="preserve"> the dropdown list or type in a custom purpose followed by </w:t>
       </w:r>
       <w:r>
         <w:rPr>
@@ -1068,7 +1200,55 @@
           <w:sz w:val="28"/>
           <w:szCs w:val="28"/>
         </w:rPr>
-        <w:t xml:space="preserve"> work in tandem.  Notice that ‘Subjects Found’ is disabled until the number of subjects is entered.  Once that is done select the number of subjects found which enables the table to the right.  For each subject found a single click under the heading ‘Indication on Initial Find’ or ‘Indication on Refind’ presents a dropdown box to fill in the </w:t>
+        <w:t xml:space="preserve"> work in tandem.  Notice that ‘Subjects Found’ is disabled until the number of subjects is entered.  Once that is done select the number of subjects found which </w:t>
+      </w:r>
+      <w:proofErr w:type="gramStart"/>
+      <w:r>
+        <w:rPr>
+          <w:sz w:val="28"/>
+          <w:szCs w:val="28"/>
+        </w:rPr>
+        <w:t>enables</w:t>
+      </w:r>
+      <w:proofErr w:type="gramEnd"/>
+      <w:r>
+        <w:rPr>
+          <w:sz w:val="28"/>
+          <w:szCs w:val="28"/>
+        </w:rPr>
+        <w:t xml:space="preserve"> the table to the right.  For each </w:t>
+      </w:r>
+      <w:proofErr w:type="gramStart"/>
+      <w:r>
+        <w:rPr>
+          <w:sz w:val="28"/>
+          <w:szCs w:val="28"/>
+        </w:rPr>
+        <w:t>subject found</w:t>
+      </w:r>
+      <w:proofErr w:type="gramEnd"/>
+      <w:r>
+        <w:rPr>
+          <w:sz w:val="28"/>
+          <w:szCs w:val="28"/>
+        </w:rPr>
+        <w:t xml:space="preserve"> a single click under the heading ‘Indication on Initial Find’ or ‘Indication on </w:t>
+      </w:r>
+      <w:proofErr w:type="spellStart"/>
+      <w:r>
+        <w:rPr>
+          <w:sz w:val="28"/>
+          <w:szCs w:val="28"/>
+        </w:rPr>
+        <w:t>Refind</w:t>
+      </w:r>
+      <w:proofErr w:type="spellEnd"/>
+      <w:r>
+        <w:rPr>
+          <w:sz w:val="28"/>
+          <w:szCs w:val="28"/>
+        </w:rPr>
+        <w:t xml:space="preserve">’ presents a dropdown box to fill in the </w:t>
       </w:r>
       <w:r>
         <w:rPr>
@@ -1152,7 +1332,39 @@
           <w:sz w:val="28"/>
           <w:szCs w:val="28"/>
         </w:rPr>
-        <w:t xml:space="preserve">.  Notice that the pair will then present in the </w:t>
+        <w:t xml:space="preserve">.  Notice that the pair will then </w:t>
+      </w:r>
+      <w:proofErr w:type="gramStart"/>
+      <w:r>
+        <w:rPr>
+          <w:sz w:val="28"/>
+          <w:szCs w:val="28"/>
+        </w:rPr>
+        <w:t>present</w:t>
+      </w:r>
+      <w:proofErr w:type="gramEnd"/>
+      <w:r>
+        <w:rPr>
+          <w:sz w:val="28"/>
+          <w:szCs w:val="28"/>
+        </w:rPr>
+        <w:t xml:space="preserve"> </w:t>
+      </w:r>
+      <w:proofErr w:type="gramStart"/>
+      <w:r>
+        <w:rPr>
+          <w:sz w:val="28"/>
+          <w:szCs w:val="28"/>
+        </w:rPr>
+        <w:t>in</w:t>
+      </w:r>
+      <w:proofErr w:type="gramEnd"/>
+      <w:r>
+        <w:rPr>
+          <w:sz w:val="28"/>
+          <w:szCs w:val="28"/>
+        </w:rPr>
+        <w:t xml:space="preserve"> the </w:t>
       </w:r>
       <w:r>
         <w:rPr>
@@ -1399,12 +1611,21 @@
         </w:rPr>
         <w:t xml:space="preserve">also </w:t>
       </w:r>
-      <w:r>
-        <w:rPr>
-          <w:sz w:val="28"/>
-          <w:szCs w:val="28"/>
-        </w:rPr>
-        <w:t xml:space="preserve">has the ability to hide a session.  This function is </w:t>
+      <w:proofErr w:type="gramStart"/>
+      <w:r>
+        <w:rPr>
+          <w:sz w:val="28"/>
+          <w:szCs w:val="28"/>
+        </w:rPr>
+        <w:t>has the ability to</w:t>
+      </w:r>
+      <w:proofErr w:type="gramEnd"/>
+      <w:r>
+        <w:rPr>
+          <w:sz w:val="28"/>
+          <w:szCs w:val="28"/>
+        </w:rPr>
+        <w:t xml:space="preserve"> hide a session.  This function is </w:t>
       </w:r>
       <w:r>
         <w:rPr>
@@ -1530,6 +1751,7 @@
     <w:p>
       <w:pPr>
         <w:pStyle w:val="Heading1"/>
+        <w:jc w:val="both"/>
       </w:pPr>
       <w:r>
         <w:t>Backup Details</w:t>
@@ -1537,6 +1759,7 @@
     </w:p>
     <w:p>
       <w:pPr>
+        <w:jc w:val="both"/>
         <w:rPr>
           <w:sz w:val="28"/>
           <w:szCs w:val="28"/>
@@ -1557,17 +1780,34 @@
           <w:ilvl w:val="0"/>
           <w:numId w:val="3"/>
         </w:numPr>
-        <w:rPr>
-          <w:sz w:val="28"/>
-          <w:szCs w:val="28"/>
-        </w:rPr>
-      </w:pPr>
-      <w:r>
-        <w:rPr>
-          <w:sz w:val="28"/>
-          <w:szCs w:val="28"/>
-        </w:rPr>
-        <w:t>Full backup to the Primary Storage Folder</w:t>
+        <w:jc w:val="both"/>
+        <w:rPr>
+          <w:sz w:val="28"/>
+          <w:szCs w:val="28"/>
+        </w:rPr>
+      </w:pPr>
+      <w:r>
+        <w:rPr>
+          <w:sz w:val="28"/>
+          <w:szCs w:val="28"/>
+        </w:rPr>
+        <w:t xml:space="preserve">Full </w:t>
+      </w:r>
+      <w:proofErr w:type="spellStart"/>
+      <w:r>
+        <w:rPr>
+          <w:sz w:val="28"/>
+          <w:szCs w:val="28"/>
+        </w:rPr>
+        <w:t>backup</w:t>
+      </w:r>
+      <w:proofErr w:type="spellEnd"/>
+      <w:r>
+        <w:rPr>
+          <w:sz w:val="28"/>
+          <w:szCs w:val="28"/>
+        </w:rPr>
+        <w:t xml:space="preserve"> to the Primary Storage Folder</w:t>
       </w:r>
     </w:p>
     <w:p>
@@ -1577,17 +1817,34 @@
           <w:ilvl w:val="0"/>
           <w:numId w:val="3"/>
         </w:numPr>
-        <w:rPr>
-          <w:sz w:val="28"/>
-          <w:szCs w:val="28"/>
-        </w:rPr>
-      </w:pPr>
-      <w:r>
-        <w:rPr>
-          <w:sz w:val="28"/>
-          <w:szCs w:val="28"/>
-        </w:rPr>
-        <w:t>Full backup to the Secondary Storage Folder</w:t>
+        <w:jc w:val="both"/>
+        <w:rPr>
+          <w:sz w:val="28"/>
+          <w:szCs w:val="28"/>
+        </w:rPr>
+      </w:pPr>
+      <w:r>
+        <w:rPr>
+          <w:sz w:val="28"/>
+          <w:szCs w:val="28"/>
+        </w:rPr>
+        <w:t xml:space="preserve">Full </w:t>
+      </w:r>
+      <w:proofErr w:type="spellStart"/>
+      <w:r>
+        <w:rPr>
+          <w:sz w:val="28"/>
+          <w:szCs w:val="28"/>
+        </w:rPr>
+        <w:t>backup</w:t>
+      </w:r>
+      <w:proofErr w:type="spellEnd"/>
+      <w:r>
+        <w:rPr>
+          <w:sz w:val="28"/>
+          <w:szCs w:val="28"/>
+        </w:rPr>
+        <w:t xml:space="preserve"> to the Secondary Storage Folder</w:t>
       </w:r>
     </w:p>
     <w:p>
@@ -1597,6 +1854,7 @@
           <w:ilvl w:val="0"/>
           <w:numId w:val="3"/>
         </w:numPr>
+        <w:jc w:val="both"/>
         <w:rPr>
           <w:sz w:val="28"/>
           <w:szCs w:val="28"/>
@@ -1614,8 +1872,244 @@
           <w:sz w:val="28"/>
           <w:szCs w:val="28"/>
         </w:rPr>
-        <w:t xml:space="preserve"> Also, note that it may generate a ‘Conflict’ between remote data and local data.  Select Remote to incorporate your changes.</w:t>
-      </w:r>
+        <w:t xml:space="preserve"> Also, note that it may generate a ‘Conflict’ between remote data and local data.  Select Remote to incorporate </w:t>
+      </w:r>
+      <w:r>
+        <w:rPr>
+          <w:sz w:val="28"/>
+          <w:szCs w:val="28"/>
+        </w:rPr>
+        <w:t>the latest</w:t>
+      </w:r>
+      <w:r>
+        <w:rPr>
+          <w:sz w:val="28"/>
+          <w:szCs w:val="28"/>
+        </w:rPr>
+        <w:t xml:space="preserve"> changes.</w:t>
+      </w:r>
+      <w:r>
+        <w:rPr>
+          <w:sz w:val="28"/>
+          <w:szCs w:val="28"/>
+        </w:rPr>
+        <w:t xml:space="preserve"> If there is a question, the user should probably consult with the other user(s) prior to accepting changes.</w:t>
+      </w:r>
+    </w:p>
+    <w:p>
+      <w:pPr>
+        <w:jc w:val="both"/>
+        <w:rPr>
+          <w:sz w:val="28"/>
+          <w:szCs w:val="28"/>
+        </w:rPr>
+      </w:pPr>
+      <w:r>
+        <w:rPr>
+          <w:sz w:val="28"/>
+          <w:szCs w:val="28"/>
+        </w:rPr>
+        <w:lastRenderedPageBreak/>
+        <w:t>In the event of a hardware crash, once the hardware is repaired, first try starting the program.  If an error occurs stating the database is corrupted, then use the following procedure:</w:t>
+      </w:r>
+    </w:p>
+    <w:p>
+      <w:pPr>
+        <w:pStyle w:val="ListParagraph"/>
+        <w:numPr>
+          <w:ilvl w:val="0"/>
+          <w:numId w:val="5"/>
+        </w:numPr>
+        <w:jc w:val="both"/>
+        <w:rPr>
+          <w:sz w:val="28"/>
+          <w:szCs w:val="28"/>
+        </w:rPr>
+      </w:pPr>
+      <w:r>
+        <w:rPr>
+          <w:sz w:val="28"/>
+          <w:szCs w:val="28"/>
+        </w:rPr>
+        <w:t>Initialize the database</w:t>
+      </w:r>
+    </w:p>
+    <w:p>
+      <w:pPr>
+        <w:pStyle w:val="ListParagraph"/>
+        <w:numPr>
+          <w:ilvl w:val="0"/>
+          <w:numId w:val="5"/>
+        </w:numPr>
+        <w:jc w:val="both"/>
+        <w:rPr>
+          <w:sz w:val="28"/>
+          <w:szCs w:val="28"/>
+        </w:rPr>
+      </w:pPr>
+      <w:r>
+        <w:rPr>
+          <w:sz w:val="28"/>
+          <w:szCs w:val="28"/>
+        </w:rPr>
+        <w:t>Try restoring from the Primary Storage Folder</w:t>
+      </w:r>
+    </w:p>
+    <w:p>
+      <w:pPr>
+        <w:pStyle w:val="ListParagraph"/>
+        <w:numPr>
+          <w:ilvl w:val="0"/>
+          <w:numId w:val="5"/>
+        </w:numPr>
+        <w:jc w:val="both"/>
+        <w:rPr>
+          <w:sz w:val="28"/>
+          <w:szCs w:val="28"/>
+        </w:rPr>
+      </w:pPr>
+      <w:r>
+        <w:rPr>
+          <w:sz w:val="28"/>
+          <w:szCs w:val="28"/>
+        </w:rPr>
+        <w:t xml:space="preserve">If that fails, try to </w:t>
+      </w:r>
+      <w:proofErr w:type="gramStart"/>
+      <w:r>
+        <w:rPr>
+          <w:sz w:val="28"/>
+          <w:szCs w:val="28"/>
+        </w:rPr>
+        <w:t>restore</w:t>
+      </w:r>
+      <w:proofErr w:type="gramEnd"/>
+      <w:r>
+        <w:rPr>
+          <w:sz w:val="28"/>
+          <w:szCs w:val="28"/>
+        </w:rPr>
+        <w:t xml:space="preserve"> from the Secondary Storage Folder.</w:t>
+      </w:r>
+    </w:p>
+    <w:p>
+      <w:pPr>
+        <w:pStyle w:val="ListParagraph"/>
+        <w:numPr>
+          <w:ilvl w:val="0"/>
+          <w:numId w:val="5"/>
+        </w:numPr>
+        <w:jc w:val="both"/>
+        <w:rPr>
+          <w:sz w:val="28"/>
+          <w:szCs w:val="28"/>
+        </w:rPr>
+      </w:pPr>
+      <w:r>
+        <w:rPr>
+          <w:sz w:val="28"/>
+          <w:szCs w:val="28"/>
+        </w:rPr>
+        <w:t xml:space="preserve">As a last resort, try </w:t>
+      </w:r>
+      <w:proofErr w:type="gramStart"/>
+      <w:r>
+        <w:rPr>
+          <w:sz w:val="28"/>
+          <w:szCs w:val="28"/>
+        </w:rPr>
+        <w:t>restoring from</w:t>
+      </w:r>
+      <w:proofErr w:type="gramEnd"/>
+      <w:r>
+        <w:rPr>
+          <w:sz w:val="28"/>
+          <w:szCs w:val="28"/>
+        </w:rPr>
+        <w:t xml:space="preserve"> the Excel files.  Remember that Area Search and Trailing data are in separate files so it may be necessary to </w:t>
+      </w:r>
+      <w:proofErr w:type="gramStart"/>
+      <w:r>
+        <w:rPr>
+          <w:sz w:val="28"/>
+          <w:szCs w:val="28"/>
+        </w:rPr>
+        <w:t>restore</w:t>
+      </w:r>
+      <w:proofErr w:type="gramEnd"/>
+      <w:r>
+        <w:rPr>
+          <w:sz w:val="28"/>
+          <w:szCs w:val="28"/>
+        </w:rPr>
+        <w:t xml:space="preserve"> from both.</w:t>
+      </w:r>
+    </w:p>
+    <w:p>
+      <w:pPr>
+        <w:pStyle w:val="Heading1"/>
+        <w:jc w:val="both"/>
+      </w:pPr>
+      <w:r>
+        <w:t>Use Across Multiple Machines</w:t>
+      </w:r>
+    </w:p>
+    <w:p>
+      <w:pPr>
+        <w:jc w:val="both"/>
+        <w:rPr>
+          <w:sz w:val="28"/>
+          <w:szCs w:val="28"/>
+        </w:rPr>
+      </w:pPr>
+      <w:r>
+        <w:rPr>
+          <w:sz w:val="28"/>
+          <w:szCs w:val="28"/>
+        </w:rPr>
+        <w:t xml:space="preserve">Limited synchronization is possible across multiple machines when the Secondary Storage Folder is located on a networked drive, Google Drive, Microsoft OneDrive, or Dropbox. This allows you to edit a session on one machine and have it </w:t>
+      </w:r>
+      <w:proofErr w:type="gramStart"/>
+      <w:r>
+        <w:rPr>
+          <w:sz w:val="28"/>
+          <w:szCs w:val="28"/>
+        </w:rPr>
+        <w:t>duplicate</w:t>
+      </w:r>
+      <w:proofErr w:type="gramEnd"/>
+      <w:r>
+        <w:rPr>
+          <w:sz w:val="28"/>
+          <w:szCs w:val="28"/>
+        </w:rPr>
+        <w:t xml:space="preserve"> on a second.  At startup the program checks that Secondary Folder and if there is newer data present the user is presented with a summary of changes which they can then choose to accept or reject.  Note, however, that this is not a true networked application.  This means that </w:t>
+      </w:r>
+      <w:proofErr w:type="gramStart"/>
+      <w:r>
+        <w:rPr>
+          <w:sz w:val="28"/>
+          <w:szCs w:val="28"/>
+        </w:rPr>
+        <w:t>If</w:t>
+      </w:r>
+      <w:proofErr w:type="gramEnd"/>
+      <w:r>
+        <w:rPr>
+          <w:sz w:val="28"/>
+          <w:szCs w:val="28"/>
+        </w:rPr>
+        <w:t xml:space="preserve"> multiple individuals are editing at the same time, data loss could occur.  Should a message pop up stating that there is another copy present, follow the prompts. If in doubt it is advisable to contact any other user prior to continuing. (If you were the one editing and you just forgot to exit the program, it is safe to continue)</w:t>
+      </w:r>
+    </w:p>
+    <w:p>
+      <w:pPr>
+        <w:jc w:val="both"/>
+        <w:rPr>
+          <w:sz w:val="28"/>
+          <w:szCs w:val="28"/>
+        </w:rPr>
+      </w:pPr>
     </w:p>
     <w:p>
       <w:pPr>
@@ -1639,6 +2133,95 @@
 <file path=word/numbering.xml><?xml version="1.0" encoding="utf-8"?>
 <w:numbering xmlns:wpc="http://schemas.microsoft.com/office/word/2010/wordprocessingCanvas" xmlns:cx="http://schemas.microsoft.com/office/drawing/2014/chartex" xmlns:cx1="http://schemas.microsoft.com/office/drawing/2015/9/8/chartex" xmlns:cx2="http://schemas.microsoft.com/office/drawing/2015/10/21/chartex" xmlns:cx3="http://schemas.microsoft.com/office/drawing/2016/5/9/chartex" xmlns:cx4="http://schemas.microsoft.com/office/drawing/2016/5/10/chartex" xmlns:cx5="http://schemas.microsoft.com/office/drawing/2016/5/11/chartex" xmlns:cx6="http://schemas.microsoft.com/office/drawing/2016/5/12/chartex" xmlns:cx7="http://schemas.microsoft.com/office/drawing/2016/5/13/chartex" xmlns:cx8="http://schemas.microsoft.com/office/drawing/2016/5/14/chartex" xmlns:mc="http://schemas.openxmlformats.org/markup-compatibility/2006" xmlns:aink="http://schemas.microsoft.com/office/drawing/2016/ink" xmlns:am3d="http://schemas.microsoft.com/office/drawing/2017/model3d" xmlns:o="urn:schemas-microsoft-com:office:office" xmlns:oel="http://schemas.microsoft.com/office/2019/extlst" xmlns:r="http://schemas.openxmlformats.org/officeDocument/2006/relationships" xmlns:m="http://schemas.openxmlformats.org/officeDocument/2006/math" xmlns:v="urn:schemas-microsoft-com:vml" xmlns:wp14="http://schemas.microsoft.com/office/word/2010/wordprocessingDrawing" xmlns:wp="http://schemas.openxmlformats.org/drawingml/2006/wordprocessingDrawing" xmlns:w10="urn:schemas-microsoft-com:office:word" xmlns:w="http://schemas.openxmlformats.org/wordprocessingml/2006/main" xmlns:w14="http://schemas.microsoft.com/office/word/2010/wordml" xmlns:w15="http://schemas.microsoft.com/office/word/2012/wordml" xmlns:w16cex="http://schemas.microsoft.com/office/word/2018/wordml/cex" xmlns:w16cid="http://schemas.microsoft.com/office/word/2016/wordml/cid" xmlns:w16="http://schemas.microsoft.com/office/word/2018/wordml" xmlns:w16du="http://schemas.microsoft.com/office/word/2023/wordml/word16du" xmlns:w16sdtdh="http://schemas.microsoft.com/office/word/2020/wordml/sdtdatahash" xmlns:w16sdtfl="http://schemas.microsoft.com/office/word/2024/wordml/sdtformatlock" xmlns:w16se="http://schemas.microsoft.com/office/word/2015/wordml/symex" xmlns:wpg="http://schemas.microsoft.com/office/word/2010/wordprocessingGroup" xmlns:wpi="http://schemas.microsoft.com/office/word/2010/wordprocessingInk" xmlns:wne="http://schemas.microsoft.com/office/word/2006/wordml" xmlns:wps="http://schemas.microsoft.com/office/word/2010/wordprocessingShape" mc:Ignorable="w14 w15 w16se w16cid w16 w16cex w16sdtdh w16sdtfl w16du wp14">
   <w:abstractNum w:abstractNumId="0" w15:restartNumberingAfterBreak="0">
+    <w:nsid w:val="1E821C57"/>
+    <w:multiLevelType w:val="hybridMultilevel"/>
+    <w:tmpl w:val="7EA85D1A"/>
+    <w:lvl w:ilvl="0" w:tplc="04090011">
+      <w:start w:val="1"/>
+      <w:numFmt w:val="decimal"/>
+      <w:lvlText w:val="%1)"/>
+      <w:lvlJc w:val="left"/>
+      <w:pPr>
+        <w:ind w:left="720" w:hanging="360"/>
+      </w:pPr>
+      <w:rPr>
+        <w:rFonts w:hint="default"/>
+      </w:rPr>
+    </w:lvl>
+    <w:lvl w:ilvl="1" w:tplc="04090019" w:tentative="1">
+      <w:start w:val="1"/>
+      <w:numFmt w:val="lowerLetter"/>
+      <w:lvlText w:val="%2."/>
+      <w:lvlJc w:val="left"/>
+      <w:pPr>
+        <w:ind w:left="1440" w:hanging="360"/>
+      </w:pPr>
+    </w:lvl>
+    <w:lvl w:ilvl="2" w:tplc="0409001B" w:tentative="1">
+      <w:start w:val="1"/>
+      <w:numFmt w:val="lowerRoman"/>
+      <w:lvlText w:val="%3."/>
+      <w:lvlJc w:val="right"/>
+      <w:pPr>
+        <w:ind w:left="2160" w:hanging="180"/>
+      </w:pPr>
+    </w:lvl>
+    <w:lvl w:ilvl="3" w:tplc="0409000F" w:tentative="1">
+      <w:start w:val="1"/>
+      <w:numFmt w:val="decimal"/>
+      <w:lvlText w:val="%4."/>
+      <w:lvlJc w:val="left"/>
+      <w:pPr>
+        <w:ind w:left="2880" w:hanging="360"/>
+      </w:pPr>
+    </w:lvl>
+    <w:lvl w:ilvl="4" w:tplc="04090019" w:tentative="1">
+      <w:start w:val="1"/>
+      <w:numFmt w:val="lowerLetter"/>
+      <w:lvlText w:val="%5."/>
+      <w:lvlJc w:val="left"/>
+      <w:pPr>
+        <w:ind w:left="3600" w:hanging="360"/>
+      </w:pPr>
+    </w:lvl>
+    <w:lvl w:ilvl="5" w:tplc="0409001B" w:tentative="1">
+      <w:start w:val="1"/>
+      <w:numFmt w:val="lowerRoman"/>
+      <w:lvlText w:val="%6."/>
+      <w:lvlJc w:val="right"/>
+      <w:pPr>
+        <w:ind w:left="4320" w:hanging="180"/>
+      </w:pPr>
+    </w:lvl>
+    <w:lvl w:ilvl="6" w:tplc="0409000F" w:tentative="1">
+      <w:start w:val="1"/>
+      <w:numFmt w:val="decimal"/>
+      <w:lvlText w:val="%7."/>
+      <w:lvlJc w:val="left"/>
+      <w:pPr>
+        <w:ind w:left="5040" w:hanging="360"/>
+      </w:pPr>
+    </w:lvl>
+    <w:lvl w:ilvl="7" w:tplc="04090019" w:tentative="1">
+      <w:start w:val="1"/>
+      <w:numFmt w:val="lowerLetter"/>
+      <w:lvlText w:val="%8."/>
+      <w:lvlJc w:val="left"/>
+      <w:pPr>
+        <w:ind w:left="5760" w:hanging="360"/>
+      </w:pPr>
+    </w:lvl>
+    <w:lvl w:ilvl="8" w:tplc="0409001B" w:tentative="1">
+      <w:start w:val="1"/>
+      <w:numFmt w:val="lowerRoman"/>
+      <w:lvlText w:val="%9."/>
+      <w:lvlJc w:val="right"/>
+      <w:pPr>
+        <w:ind w:left="6480" w:hanging="180"/>
+      </w:pPr>
+    </w:lvl>
+  </w:abstractNum>
+  <w:abstractNum w:abstractNumId="1" w15:restartNumberingAfterBreak="0">
     <w:nsid w:val="3C0551B9"/>
     <w:multiLevelType w:val="hybridMultilevel"/>
     <w:tmpl w:val="80281EFE"/>
@@ -1727,7 +2310,7 @@
       </w:pPr>
     </w:lvl>
   </w:abstractNum>
-  <w:abstractNum w:abstractNumId="1" w15:restartNumberingAfterBreak="0">
+  <w:abstractNum w:abstractNumId="2" w15:restartNumberingAfterBreak="0">
     <w:nsid w:val="61C05AFD"/>
     <w:multiLevelType w:val="hybridMultilevel"/>
     <w:tmpl w:val="E216EDB2"/>
@@ -1816,7 +2399,96 @@
       </w:pPr>
     </w:lvl>
   </w:abstractNum>
-  <w:abstractNum w:abstractNumId="2" w15:restartNumberingAfterBreak="0">
+  <w:abstractNum w:abstractNumId="3" w15:restartNumberingAfterBreak="0">
+    <w:nsid w:val="66936DA7"/>
+    <w:multiLevelType w:val="hybridMultilevel"/>
+    <w:tmpl w:val="EF1825E6"/>
+    <w:lvl w:ilvl="0" w:tplc="04090011">
+      <w:start w:val="1"/>
+      <w:numFmt w:val="decimal"/>
+      <w:lvlText w:val="%1)"/>
+      <w:lvlJc w:val="left"/>
+      <w:pPr>
+        <w:ind w:left="720" w:hanging="360"/>
+      </w:pPr>
+      <w:rPr>
+        <w:rFonts w:hint="default"/>
+      </w:rPr>
+    </w:lvl>
+    <w:lvl w:ilvl="1" w:tplc="04090019" w:tentative="1">
+      <w:start w:val="1"/>
+      <w:numFmt w:val="lowerLetter"/>
+      <w:lvlText w:val="%2."/>
+      <w:lvlJc w:val="left"/>
+      <w:pPr>
+        <w:ind w:left="1440" w:hanging="360"/>
+      </w:pPr>
+    </w:lvl>
+    <w:lvl w:ilvl="2" w:tplc="0409001B" w:tentative="1">
+      <w:start w:val="1"/>
+      <w:numFmt w:val="lowerRoman"/>
+      <w:lvlText w:val="%3."/>
+      <w:lvlJc w:val="right"/>
+      <w:pPr>
+        <w:ind w:left="2160" w:hanging="180"/>
+      </w:pPr>
+    </w:lvl>
+    <w:lvl w:ilvl="3" w:tplc="0409000F" w:tentative="1">
+      <w:start w:val="1"/>
+      <w:numFmt w:val="decimal"/>
+      <w:lvlText w:val="%4."/>
+      <w:lvlJc w:val="left"/>
+      <w:pPr>
+        <w:ind w:left="2880" w:hanging="360"/>
+      </w:pPr>
+    </w:lvl>
+    <w:lvl w:ilvl="4" w:tplc="04090019" w:tentative="1">
+      <w:start w:val="1"/>
+      <w:numFmt w:val="lowerLetter"/>
+      <w:lvlText w:val="%5."/>
+      <w:lvlJc w:val="left"/>
+      <w:pPr>
+        <w:ind w:left="3600" w:hanging="360"/>
+      </w:pPr>
+    </w:lvl>
+    <w:lvl w:ilvl="5" w:tplc="0409001B" w:tentative="1">
+      <w:start w:val="1"/>
+      <w:numFmt w:val="lowerRoman"/>
+      <w:lvlText w:val="%6."/>
+      <w:lvlJc w:val="right"/>
+      <w:pPr>
+        <w:ind w:left="4320" w:hanging="180"/>
+      </w:pPr>
+    </w:lvl>
+    <w:lvl w:ilvl="6" w:tplc="0409000F" w:tentative="1">
+      <w:start w:val="1"/>
+      <w:numFmt w:val="decimal"/>
+      <w:lvlText w:val="%7."/>
+      <w:lvlJc w:val="left"/>
+      <w:pPr>
+        <w:ind w:left="5040" w:hanging="360"/>
+      </w:pPr>
+    </w:lvl>
+    <w:lvl w:ilvl="7" w:tplc="04090019" w:tentative="1">
+      <w:start w:val="1"/>
+      <w:numFmt w:val="lowerLetter"/>
+      <w:lvlText w:val="%8."/>
+      <w:lvlJc w:val="left"/>
+      <w:pPr>
+        <w:ind w:left="5760" w:hanging="360"/>
+      </w:pPr>
+    </w:lvl>
+    <w:lvl w:ilvl="8" w:tplc="0409001B" w:tentative="1">
+      <w:start w:val="1"/>
+      <w:numFmt w:val="lowerRoman"/>
+      <w:lvlText w:val="%9."/>
+      <w:lvlJc w:val="right"/>
+      <w:pPr>
+        <w:ind w:left="6480" w:hanging="180"/>
+      </w:pPr>
+    </w:lvl>
+  </w:abstractNum>
+  <w:abstractNum w:abstractNumId="4" w15:restartNumberingAfterBreak="0">
     <w:nsid w:val="7A2956EE"/>
     <w:multiLevelType w:val="hybridMultilevel"/>
     <w:tmpl w:val="BBE8451C"/>
@@ -1906,13 +2578,19 @@
     </w:lvl>
   </w:abstractNum>
   <w:num w:numId="1" w16cid:durableId="1619990160">
-    <w:abstractNumId w:val="0"/>
+    <w:abstractNumId w:val="1"/>
   </w:num>
   <w:num w:numId="2" w16cid:durableId="1733845587">
+    <w:abstractNumId w:val="4"/>
+  </w:num>
+  <w:num w:numId="3" w16cid:durableId="790323579">
     <w:abstractNumId w:val="2"/>
   </w:num>
-  <w:num w:numId="3" w16cid:durableId="790323579">
-    <w:abstractNumId w:val="1"/>
+  <w:num w:numId="4" w16cid:durableId="1607153943">
+    <w:abstractNumId w:val="3"/>
+  </w:num>
+  <w:num w:numId="5" w16cid:durableId="486290279">
+    <w:abstractNumId w:val="0"/>
   </w:num>
 </w:numbering>
 </file>

</xml_diff>

<commit_message>
More work on backup strategy
</commit_message>
<xml_diff>
--- a/SAR K9 Training Record User Manual.docx
+++ b/SAR K9 Training Record User Manual.docx
@@ -102,17 +102,8 @@
           <w:sz w:val="28"/>
           <w:szCs w:val="28"/>
         </w:rPr>
-        <w:t>\</w:t>
-      </w:r>
-      <w:proofErr w:type="gramStart"/>
-      <w:r>
-        <w:rPr>
-          <w:sz w:val="28"/>
-          <w:szCs w:val="28"/>
-        </w:rPr>
-        <w:t>I{</w:t>
-      </w:r>
-      <w:proofErr w:type="gramEnd"/>
+        <w:t>\I{</w:t>
+      </w:r>
       <w:r>
         <w:rPr>
           <w:b/>
@@ -234,17 +225,8 @@
           <w:sz w:val="28"/>
           <w:szCs w:val="28"/>
         </w:rPr>
-        <w:t>\</w:t>
-      </w:r>
-      <w:proofErr w:type="gramStart"/>
-      <w:r>
-        <w:rPr>
-          <w:sz w:val="28"/>
-          <w:szCs w:val="28"/>
-        </w:rPr>
-        <w:t>I{</w:t>
-      </w:r>
-      <w:proofErr w:type="gramEnd"/>
+        <w:t>\I{</w:t>
+      </w:r>
       <w:r>
         <w:rPr>
           <w:sz w:val="28"/>
@@ -508,30 +490,14 @@
           <w:sz w:val="28"/>
           <w:szCs w:val="28"/>
         </w:rPr>
-        <w:t xml:space="preserve">The </w:t>
-      </w:r>
-      <w:proofErr w:type="gramStart"/>
-      <w:r>
-        <w:rPr>
-          <w:sz w:val="28"/>
-          <w:szCs w:val="28"/>
-        </w:rPr>
-        <w:t>m</w:t>
-      </w:r>
-      <w:r>
-        <w:rPr>
-          <w:sz w:val="28"/>
-          <w:szCs w:val="28"/>
-        </w:rPr>
-        <w:t>ost commonly used</w:t>
-      </w:r>
-      <w:proofErr w:type="gramEnd"/>
-      <w:r>
-        <w:rPr>
-          <w:sz w:val="28"/>
-          <w:szCs w:val="28"/>
-        </w:rPr>
-        <w:t xml:space="preserve"> entries should usually appear at the top of each list.</w:t>
+        <w:t>The m</w:t>
+      </w:r>
+      <w:r>
+        <w:rPr>
+          <w:sz w:val="28"/>
+          <w:szCs w:val="28"/>
+        </w:rPr>
+        <w:t>ost commonly used entries should usually appear at the top of each list.</w:t>
       </w:r>
     </w:p>
     <w:p>
@@ -575,17 +541,8 @@
           <w:sz w:val="28"/>
           <w:szCs w:val="28"/>
         </w:rPr>
-        <w:t xml:space="preserve"> \</w:t>
-      </w:r>
-      <w:proofErr w:type="gramStart"/>
-      <w:r>
-        <w:rPr>
-          <w:sz w:val="28"/>
-          <w:szCs w:val="28"/>
-        </w:rPr>
-        <w:t>N{</w:t>
-      </w:r>
-      <w:proofErr w:type="gramEnd"/>
+        <w:t xml:space="preserve"> \N{</w:t>
+      </w:r>
       <w:r>
         <w:rPr>
           <w:sz w:val="28"/>
@@ -704,17 +661,8 @@
           <w:sz w:val="28"/>
           <w:szCs w:val="28"/>
         </w:rPr>
-        <w:t>grey windows must use the dropdown by clicking the \</w:t>
-      </w:r>
-      <w:proofErr w:type="gramStart"/>
-      <w:r>
-        <w:rPr>
-          <w:sz w:val="28"/>
-          <w:szCs w:val="28"/>
-        </w:rPr>
-        <w:t>N{</w:t>
-      </w:r>
-      <w:proofErr w:type="gramEnd"/>
+        <w:t>grey windows must use the dropdown by clicking the \N{</w:t>
+      </w:r>
       <w:r>
         <w:rPr>
           <w:sz w:val="28"/>
@@ -734,69 +682,21 @@
           <w:sz w:val="28"/>
           <w:szCs w:val="28"/>
         </w:rPr>
-        <w:t>or \</w:t>
-      </w:r>
-      <w:proofErr w:type="gramStart"/>
-      <w:r>
-        <w:rPr>
-          <w:sz w:val="28"/>
-          <w:szCs w:val="28"/>
-        </w:rPr>
-        <w:t>N{</w:t>
-      </w:r>
-      <w:proofErr w:type="gramEnd"/>
-      <w:r>
-        <w:rPr>
-          <w:sz w:val="28"/>
-          <w:szCs w:val="28"/>
-        </w:rPr>
-        <w:t xml:space="preserve">Black Down-Pointing Triangle} </w:t>
-      </w:r>
-      <w:r>
-        <w:rPr>
-          <w:sz w:val="28"/>
-          <w:szCs w:val="28"/>
-        </w:rPr>
-        <w:t>on the right side of the entry. A few of the white entry fields also have a \</w:t>
-      </w:r>
-      <w:proofErr w:type="gramStart"/>
-      <w:r>
-        <w:rPr>
-          <w:sz w:val="28"/>
-          <w:szCs w:val="28"/>
-        </w:rPr>
-        <w:t>N{</w:t>
-      </w:r>
-      <w:proofErr w:type="gramEnd"/>
-      <w:r>
-        <w:rPr>
-          <w:sz w:val="28"/>
-          <w:szCs w:val="28"/>
-        </w:rPr>
-        <w:t xml:space="preserve">Modifier Letter Down Arrowhead} </w:t>
-      </w:r>
-      <w:r>
-        <w:rPr>
-          <w:sz w:val="28"/>
-          <w:szCs w:val="28"/>
-        </w:rPr>
-        <w:t>or \</w:t>
-      </w:r>
-      <w:proofErr w:type="gramStart"/>
-      <w:r>
-        <w:rPr>
-          <w:sz w:val="28"/>
-          <w:szCs w:val="28"/>
-        </w:rPr>
-        <w:t>N{</w:t>
-      </w:r>
-      <w:proofErr w:type="gramEnd"/>
-      <w:r>
-        <w:rPr>
-          <w:sz w:val="28"/>
-          <w:szCs w:val="28"/>
-        </w:rPr>
-        <w:t>Black Down-Pointing Triangle}</w:t>
+        <w:t xml:space="preserve">or \N{Black Down-Pointing Triangle} </w:t>
+      </w:r>
+      <w:r>
+        <w:rPr>
+          <w:sz w:val="28"/>
+          <w:szCs w:val="28"/>
+        </w:rPr>
+        <w:t xml:space="preserve">on the right side of the entry. A few of the white entry fields also have a \N{Modifier Letter Down Arrowhead} </w:t>
+      </w:r>
+      <w:r>
+        <w:rPr>
+          <w:sz w:val="28"/>
+          <w:szCs w:val="28"/>
+        </w:rPr>
+        <w:t>or \N{Black Down-Pointing Triangle}</w:t>
       </w:r>
       <w:r>
         <w:rPr>
@@ -890,23 +790,7 @@
           <w:sz w:val="28"/>
           <w:szCs w:val="28"/>
         </w:rPr>
-        <w:t xml:space="preserve"> Light grey in the time entry implies that no time is selected.  If </w:t>
-      </w:r>
-      <w:proofErr w:type="gramStart"/>
-      <w:r>
-        <w:rPr>
-          <w:sz w:val="28"/>
-          <w:szCs w:val="28"/>
-        </w:rPr>
-        <w:t>a time</w:t>
-      </w:r>
-      <w:proofErr w:type="gramEnd"/>
-      <w:r>
-        <w:rPr>
-          <w:sz w:val="28"/>
-          <w:szCs w:val="28"/>
-        </w:rPr>
-        <w:t xml:space="preserve"> is accidentally entered, double-click over the colon ‘:’ in that entry to unset it.</w:t>
+        <w:t xml:space="preserve"> Light grey in the time entry implies that no time is selected.  If a time is accidentally entered, double-click over the colon ‘:’ in that entry to unset it.</w:t>
       </w:r>
     </w:p>
     <w:p>
@@ -1012,23 +896,7 @@
           <w:sz w:val="28"/>
           <w:szCs w:val="28"/>
         </w:rPr>
-        <w:t xml:space="preserve"> </w:t>
-      </w:r>
-      <w:proofErr w:type="gramStart"/>
-      <w:r>
-        <w:rPr>
-          <w:sz w:val="28"/>
-          <w:szCs w:val="28"/>
-        </w:rPr>
-        <w:t>either use</w:t>
-      </w:r>
-      <w:proofErr w:type="gramEnd"/>
-      <w:r>
-        <w:rPr>
-          <w:sz w:val="28"/>
-          <w:szCs w:val="28"/>
-        </w:rPr>
-        <w:t xml:space="preserve"> the dropdown list or type in a custom purpose followed by </w:t>
+        <w:t xml:space="preserve"> either use the dropdown list or type in a custom purpose followed by </w:t>
       </w:r>
       <w:r>
         <w:rPr>
@@ -1125,6 +993,27 @@
     </w:p>
     <w:p>
       <w:pPr>
+        <w:pStyle w:val="ListParagraph"/>
+        <w:numPr>
+          <w:ilvl w:val="0"/>
+          <w:numId w:val="2"/>
+        </w:numPr>
+        <w:jc w:val="both"/>
+        <w:rPr>
+          <w:sz w:val="28"/>
+          <w:szCs w:val="28"/>
+        </w:rPr>
+      </w:pPr>
+      <w:r>
+        <w:rPr>
+          <w:sz w:val="28"/>
+          <w:szCs w:val="28"/>
+        </w:rPr>
+        <w:t>The program automatically exits after 15 minutes of non-use without saving any data. (This may be removed in a later release.)</w:t>
+      </w:r>
+    </w:p>
+    <w:p>
+      <w:pPr>
         <w:pStyle w:val="Heading1"/>
       </w:pPr>
       <w:r>
@@ -1200,55 +1089,7 @@
           <w:sz w:val="28"/>
           <w:szCs w:val="28"/>
         </w:rPr>
-        <w:t xml:space="preserve"> work in tandem.  Notice that ‘Subjects Found’ is disabled until the number of subjects is entered.  Once that is done select the number of subjects found which </w:t>
-      </w:r>
-      <w:proofErr w:type="gramStart"/>
-      <w:r>
-        <w:rPr>
-          <w:sz w:val="28"/>
-          <w:szCs w:val="28"/>
-        </w:rPr>
-        <w:t>enables</w:t>
-      </w:r>
-      <w:proofErr w:type="gramEnd"/>
-      <w:r>
-        <w:rPr>
-          <w:sz w:val="28"/>
-          <w:szCs w:val="28"/>
-        </w:rPr>
-        <w:t xml:space="preserve"> the table to the right.  For each </w:t>
-      </w:r>
-      <w:proofErr w:type="gramStart"/>
-      <w:r>
-        <w:rPr>
-          <w:sz w:val="28"/>
-          <w:szCs w:val="28"/>
-        </w:rPr>
-        <w:t>subject found</w:t>
-      </w:r>
-      <w:proofErr w:type="gramEnd"/>
-      <w:r>
-        <w:rPr>
-          <w:sz w:val="28"/>
-          <w:szCs w:val="28"/>
-        </w:rPr>
-        <w:t xml:space="preserve"> a single click under the heading ‘Indication on Initial Find’ or ‘Indication on </w:t>
-      </w:r>
-      <w:proofErr w:type="spellStart"/>
-      <w:r>
-        <w:rPr>
-          <w:sz w:val="28"/>
-          <w:szCs w:val="28"/>
-        </w:rPr>
-        <w:t>Refind</w:t>
-      </w:r>
-      <w:proofErr w:type="spellEnd"/>
-      <w:r>
-        <w:rPr>
-          <w:sz w:val="28"/>
-          <w:szCs w:val="28"/>
-        </w:rPr>
-        <w:t xml:space="preserve">’ presents a dropdown box to fill in the </w:t>
+        <w:t xml:space="preserve"> work in tandem.  Notice that ‘Subjects Found’ is disabled until the number of subjects is entered.  Once that is done select the number of subjects found which enables the table to the right.  For each subject found a single click under the heading ‘Indication on Initial Find’ or ‘Indication on Refind’ presents a dropdown box to fill in the </w:t>
       </w:r>
       <w:r>
         <w:rPr>
@@ -1332,39 +1173,7 @@
           <w:sz w:val="28"/>
           <w:szCs w:val="28"/>
         </w:rPr>
-        <w:t xml:space="preserve">.  Notice that the pair will then </w:t>
-      </w:r>
-      <w:proofErr w:type="gramStart"/>
-      <w:r>
-        <w:rPr>
-          <w:sz w:val="28"/>
-          <w:szCs w:val="28"/>
-        </w:rPr>
-        <w:t>present</w:t>
-      </w:r>
-      <w:proofErr w:type="gramEnd"/>
-      <w:r>
-        <w:rPr>
-          <w:sz w:val="28"/>
-          <w:szCs w:val="28"/>
-        </w:rPr>
-        <w:t xml:space="preserve"> </w:t>
-      </w:r>
-      <w:proofErr w:type="gramStart"/>
-      <w:r>
-        <w:rPr>
-          <w:sz w:val="28"/>
-          <w:szCs w:val="28"/>
-        </w:rPr>
-        <w:t>in</w:t>
-      </w:r>
-      <w:proofErr w:type="gramEnd"/>
-      <w:r>
-        <w:rPr>
-          <w:sz w:val="28"/>
-          <w:szCs w:val="28"/>
-        </w:rPr>
-        <w:t xml:space="preserve"> the </w:t>
+        <w:t xml:space="preserve">.  Notice that the pair will then present in the </w:t>
       </w:r>
       <w:r>
         <w:rPr>
@@ -1380,7 +1189,15 @@
           <w:sz w:val="28"/>
           <w:szCs w:val="28"/>
         </w:rPr>
-        <w:t xml:space="preserve"> table.  If not satisfied with an entry, it can be selected by hovering over the desired entry and clicking the mouse. Note that the </w:t>
+        <w:t xml:space="preserve"> table.  If not satisfied with an entry, it can be selected by hovering over the desired entry and clicking the mouse. Note </w:t>
+      </w:r>
+      <w:r>
+        <w:rPr>
+          <w:sz w:val="28"/>
+          <w:szCs w:val="28"/>
+        </w:rPr>
+        <w:lastRenderedPageBreak/>
+        <w:t xml:space="preserve">that the </w:t>
       </w:r>
       <w:r>
         <w:rPr>
@@ -1412,15 +1229,7 @@
           <w:sz w:val="28"/>
           <w:szCs w:val="28"/>
         </w:rPr>
-        <w:t xml:space="preserve"> fields list that entry and may now be edited. If </w:t>
-      </w:r>
-      <w:r>
-        <w:rPr>
-          <w:sz w:val="28"/>
-          <w:szCs w:val="28"/>
-        </w:rPr>
-        <w:lastRenderedPageBreak/>
-        <w:t xml:space="preserve">only the </w:t>
+        <w:t xml:space="preserve"> fields list that entry and may now be edited. If only the </w:t>
       </w:r>
       <w:r>
         <w:rPr>
@@ -1611,21 +1420,12 @@
         </w:rPr>
         <w:t xml:space="preserve">also </w:t>
       </w:r>
-      <w:proofErr w:type="gramStart"/>
-      <w:r>
-        <w:rPr>
-          <w:sz w:val="28"/>
-          <w:szCs w:val="28"/>
-        </w:rPr>
-        <w:t>has the ability to</w:t>
-      </w:r>
-      <w:proofErr w:type="gramEnd"/>
-      <w:r>
-        <w:rPr>
-          <w:sz w:val="28"/>
-          <w:szCs w:val="28"/>
-        </w:rPr>
-        <w:t xml:space="preserve"> hide a session.  This function is </w:t>
+      <w:r>
+        <w:rPr>
+          <w:sz w:val="28"/>
+          <w:szCs w:val="28"/>
+        </w:rPr>
+        <w:t xml:space="preserve">has the ability to hide a session.  This function is </w:t>
       </w:r>
       <w:r>
         <w:rPr>
@@ -1791,23 +1591,7 @@
           <w:sz w:val="28"/>
           <w:szCs w:val="28"/>
         </w:rPr>
-        <w:t xml:space="preserve">Full </w:t>
-      </w:r>
-      <w:proofErr w:type="spellStart"/>
-      <w:r>
-        <w:rPr>
-          <w:sz w:val="28"/>
-          <w:szCs w:val="28"/>
-        </w:rPr>
-        <w:t>backup</w:t>
-      </w:r>
-      <w:proofErr w:type="spellEnd"/>
-      <w:r>
-        <w:rPr>
-          <w:sz w:val="28"/>
-          <w:szCs w:val="28"/>
-        </w:rPr>
-        <w:t xml:space="preserve"> to the Primary Storage Folder</w:t>
+        <w:t>Full backup to the Primary Storage Folder</w:t>
       </w:r>
     </w:p>
     <w:p>
@@ -1828,23 +1612,7 @@
           <w:sz w:val="28"/>
           <w:szCs w:val="28"/>
         </w:rPr>
-        <w:t xml:space="preserve">Full </w:t>
-      </w:r>
-      <w:proofErr w:type="spellStart"/>
-      <w:r>
-        <w:rPr>
-          <w:sz w:val="28"/>
-          <w:szCs w:val="28"/>
-        </w:rPr>
-        <w:t>backup</w:t>
-      </w:r>
-      <w:proofErr w:type="spellEnd"/>
-      <w:r>
-        <w:rPr>
-          <w:sz w:val="28"/>
-          <w:szCs w:val="28"/>
-        </w:rPr>
-        <w:t xml:space="preserve"> to the Secondary Storage Folder</w:t>
+        <w:t>Full backup to the Secondary Storage Folder</w:t>
       </w:r>
     </w:p>
     <w:p>
@@ -1886,7 +1654,15 @@
           <w:sz w:val="28"/>
           <w:szCs w:val="28"/>
         </w:rPr>
-        <w:t xml:space="preserve"> changes.</w:t>
+        <w:t xml:space="preserve"> </w:t>
+      </w:r>
+      <w:r>
+        <w:rPr>
+          <w:sz w:val="28"/>
+          <w:szCs w:val="28"/>
+        </w:rPr>
+        <w:lastRenderedPageBreak/>
+        <w:t>changes.</w:t>
       </w:r>
       <w:r>
         <w:rPr>
@@ -1909,7 +1685,6 @@
           <w:sz w:val="28"/>
           <w:szCs w:val="28"/>
         </w:rPr>
-        <w:lastRenderedPageBreak/>
         <w:t>In the event of a hardware crash, once the hardware is repaired, first try starting the program.  If an error occurs stating the database is corrupted, then use the following procedure:</w:t>
       </w:r>
     </w:p>
@@ -1973,23 +1748,7 @@
           <w:sz w:val="28"/>
           <w:szCs w:val="28"/>
         </w:rPr>
-        <w:t xml:space="preserve">If that fails, try to </w:t>
-      </w:r>
-      <w:proofErr w:type="gramStart"/>
-      <w:r>
-        <w:rPr>
-          <w:sz w:val="28"/>
-          <w:szCs w:val="28"/>
-        </w:rPr>
-        <w:t>restore</w:t>
-      </w:r>
-      <w:proofErr w:type="gramEnd"/>
-      <w:r>
-        <w:rPr>
-          <w:sz w:val="28"/>
-          <w:szCs w:val="28"/>
-        </w:rPr>
-        <w:t xml:space="preserve"> from the Secondary Storage Folder.</w:t>
+        <w:t>If that fails, try to restore from the Secondary Storage Folder.</w:t>
       </w:r>
     </w:p>
     <w:p>
@@ -2010,39 +1769,7 @@
           <w:sz w:val="28"/>
           <w:szCs w:val="28"/>
         </w:rPr>
-        <w:t xml:space="preserve">As a last resort, try </w:t>
-      </w:r>
-      <w:proofErr w:type="gramStart"/>
-      <w:r>
-        <w:rPr>
-          <w:sz w:val="28"/>
-          <w:szCs w:val="28"/>
-        </w:rPr>
-        <w:t>restoring from</w:t>
-      </w:r>
-      <w:proofErr w:type="gramEnd"/>
-      <w:r>
-        <w:rPr>
-          <w:sz w:val="28"/>
-          <w:szCs w:val="28"/>
-        </w:rPr>
-        <w:t xml:space="preserve"> the Excel files.  Remember that Area Search and Trailing data are in separate files so it may be necessary to </w:t>
-      </w:r>
-      <w:proofErr w:type="gramStart"/>
-      <w:r>
-        <w:rPr>
-          <w:sz w:val="28"/>
-          <w:szCs w:val="28"/>
-        </w:rPr>
-        <w:t>restore</w:t>
-      </w:r>
-      <w:proofErr w:type="gramEnd"/>
-      <w:r>
-        <w:rPr>
-          <w:sz w:val="28"/>
-          <w:szCs w:val="28"/>
-        </w:rPr>
-        <w:t xml:space="preserve"> from both.</w:t>
+        <w:t>As a last resort, try restoring from the Excel files.  Remember that Area Search and Trailing data are in separate files so it may be necessary to restore from both.</w:t>
       </w:r>
     </w:p>
     <w:p>
@@ -2067,39 +1794,49 @@
           <w:sz w:val="28"/>
           <w:szCs w:val="28"/>
         </w:rPr>
-        <w:t xml:space="preserve">Limited synchronization is possible across multiple machines when the Secondary Storage Folder is located on a networked drive, Google Drive, Microsoft OneDrive, or Dropbox. This allows you to edit a session on one machine and have it </w:t>
-      </w:r>
-      <w:proofErr w:type="gramStart"/>
-      <w:r>
-        <w:rPr>
-          <w:sz w:val="28"/>
-          <w:szCs w:val="28"/>
-        </w:rPr>
-        <w:t>duplicate</w:t>
-      </w:r>
-      <w:proofErr w:type="gramEnd"/>
-      <w:r>
-        <w:rPr>
-          <w:sz w:val="28"/>
-          <w:szCs w:val="28"/>
-        </w:rPr>
-        <w:t xml:space="preserve"> on a second.  At startup the program checks that Secondary Folder and if there is newer data present the user is presented with a summary of changes which they can then choose to accept or reject.  Note, however, that this is not a true networked application.  This means that </w:t>
-      </w:r>
-      <w:proofErr w:type="gramStart"/>
-      <w:r>
-        <w:rPr>
-          <w:sz w:val="28"/>
-          <w:szCs w:val="28"/>
-        </w:rPr>
-        <w:t>If</w:t>
-      </w:r>
-      <w:proofErr w:type="gramEnd"/>
-      <w:r>
-        <w:rPr>
-          <w:sz w:val="28"/>
-          <w:szCs w:val="28"/>
-        </w:rPr>
-        <w:t xml:space="preserve"> multiple individuals are editing at the same time, data loss could occur.  Should a message pop up stating that there is another copy present, follow the prompts. If in doubt it is advisable to contact any other user prior to continuing. (If you were the one editing and you just forgot to exit the program, it is safe to continue)</w:t>
+        <w:t xml:space="preserve">Limited synchronization is possible across multiple machines when the Secondary Storage Folder is located on a networked drive, Google Drive, Microsoft OneDrive, or Dropbox. This allows you to edit a session on one machine and have it duplicate </w:t>
+      </w:r>
+      <w:r>
+        <w:rPr>
+          <w:sz w:val="28"/>
+          <w:szCs w:val="28"/>
+        </w:rPr>
+        <w:t xml:space="preserve">itself </w:t>
+      </w:r>
+      <w:r>
+        <w:rPr>
+          <w:sz w:val="28"/>
+          <w:szCs w:val="28"/>
+        </w:rPr>
+        <w:t xml:space="preserve">on a second.  At startup the program checks that Secondary Folder and if there is newer data present the user is presented with a summary of changes which they can then choose to accept or reject.  Note, however, that this is not a true networked application.  This means that </w:t>
+      </w:r>
+      <w:r>
+        <w:rPr>
+          <w:sz w:val="28"/>
+          <w:szCs w:val="28"/>
+        </w:rPr>
+        <w:t>if</w:t>
+      </w:r>
+      <w:r>
+        <w:rPr>
+          <w:sz w:val="28"/>
+          <w:szCs w:val="28"/>
+        </w:rPr>
+        <w:t xml:space="preserve"> multiple individuals are editing at the same time, data loss could occur.  Should a message pop up stating that there is another </w:t>
+      </w:r>
+      <w:r>
+        <w:rPr>
+          <w:sz w:val="28"/>
+          <w:szCs w:val="28"/>
+        </w:rPr>
+        <w:t>user is editing</w:t>
+      </w:r>
+      <w:r>
+        <w:rPr>
+          <w:sz w:val="28"/>
+          <w:szCs w:val="28"/>
+        </w:rPr>
+        <w:t>, follow the prompts. If in doubt it is advisable to contact any other user prior to continuing. (If you were the one editing and you just forgot to exit the program, it is safe to continue)</w:t>
       </w:r>
     </w:p>
     <w:p>

</xml_diff>

<commit_message>
Autosave unsaved entries when auto exit. Restores on next invocation
</commit_message>
<xml_diff>
--- a/SAR K9 Training Record User Manual.docx
+++ b/SAR K9 Training Record User Manual.docx
@@ -1009,7 +1009,28 @@
           <w:sz w:val="28"/>
           <w:szCs w:val="28"/>
         </w:rPr>
-        <w:t>The program automatically exits after 15 minutes of non-use without saving any data. (This may be removed in a later release.)</w:t>
+        <w:t xml:space="preserve">The program automatically exits after </w:t>
+      </w:r>
+      <w:r>
+        <w:rPr>
+          <w:sz w:val="28"/>
+          <w:szCs w:val="28"/>
+        </w:rPr>
+        <w:t>20</w:t>
+      </w:r>
+      <w:r>
+        <w:rPr>
+          <w:sz w:val="28"/>
+          <w:szCs w:val="28"/>
+        </w:rPr>
+        <w:t xml:space="preserve"> minutes of non-use</w:t>
+      </w:r>
+      <w:r>
+        <w:rPr>
+          <w:sz w:val="28"/>
+          <w:szCs w:val="28"/>
+        </w:rPr>
+        <w:t>. A snapshot of unsaved data is taken and then restored the next time the application is started.</w:t>
       </w:r>
     </w:p>
     <w:p>
@@ -1189,7 +1210,7 @@
           <w:sz w:val="28"/>
           <w:szCs w:val="28"/>
         </w:rPr>
-        <w:t xml:space="preserve"> table.  If not satisfied with an entry, it can be selected by hovering over the desired entry and clicking the mouse. Note </w:t>
+        <w:t xml:space="preserve"> table.  If not satisfied with an entry, </w:t>
       </w:r>
       <w:r>
         <w:rPr>
@@ -1197,7 +1218,7 @@
           <w:szCs w:val="28"/>
         </w:rPr>
         <w:lastRenderedPageBreak/>
-        <w:t xml:space="preserve">that the </w:t>
+        <w:t xml:space="preserve">it can be selected by hovering over the desired entry and clicking the mouse. Note that the </w:t>
       </w:r>
       <w:r>
         <w:rPr>

</xml_diff>